<commit_message>
Simscape Electrical (MATLAB R2021a) results confirmed: manuscript and proposal updated
- Table VII / Table 4.5 and text use the Simscape numbers (12 scenarios x 3
  controllers); Fig. 7 / Fig. 4.10 are the Simscape scenario-1 figure
- Simscape placeholder and checklist item removed; schedule marks it done
- docs/simscape_summary_R2021a.txt: the user's Simscape summary

Co-Authored-By: Claude Opus 5.5 <noreply@anthropic.com>
Claude-Session: https://claude.ai/code/session_01FcrrmkJTVMUBqnhfmaF7Pm
</commit_message>
<xml_diff>
--- a/paper/IREA_manuscript_PWP.docx
+++ b/paper/IREA_manuscript_PWP.docx
@@ -94,7 +94,7 @@
           <w:szCs w:val="18"/>
           <w:shd w:fill="FFFF00" w:color="auto" w:val="clear"/>
         </w:rPr>
-        <w:t xml:space="preserve">4. Confirm the circuit-level (EMT) results with the Simscape Electrical model in MATLAB R2021a (Section VIII, Limitations).</w:t>
+        <w:t xml:space="preserve">4. Update the status of references [15] (TREC) and [16] (IREMOS).</w:t>
       </w:r>
     </w:p>
     <w:p>
@@ -113,7 +113,7 @@
           <w:szCs w:val="18"/>
           <w:shd w:fill="FFFF00" w:color="auto" w:val="clear"/>
         </w:rPr>
-        <w:t xml:space="preserve">5. Update the status of references [15] (TREC) and [16] (IREMOS).</w:t>
+        <w:t xml:space="preserve">5. Add the public GitHub URL or Zenodo DOI (Data and Code Availability).</w:t>
       </w:r>
     </w:p>
     <w:p>
@@ -132,7 +132,7 @@
           <w:szCs w:val="18"/>
           <w:shd w:fill="FFFF00" w:color="auto" w:val="clear"/>
         </w:rPr>
-        <w:t xml:space="preserve">6. Add the public GitHub URL or Zenodo DOI (Data and Code Availability).</w:t>
+        <w:t xml:space="preserve">6. Confirm the funding statement (Acknowledgements).</w:t>
       </w:r>
     </w:p>
     <w:p>
@@ -151,7 +151,7 @@
           <w:szCs w:val="18"/>
           <w:shd w:fill="FFFF00" w:color="auto" w:val="clear"/>
         </w:rPr>
-        <w:t xml:space="preserve">7. Confirm the funding statement (Acknowledgements).</w:t>
+        <w:t xml:space="preserve">7. Check the year, volume and pages of every reference against its DOI.</w:t>
       </w:r>
     </w:p>
     <w:p>
@@ -170,26 +170,7 @@
           <w:szCs w:val="18"/>
           <w:shd w:fill="FFFF00" w:color="auto" w:val="clear"/>
         </w:rPr>
-        <w:t xml:space="preserve">8. Check the year, volume and pages of every reference against its DOI.</w:t>
-      </w:r>
-    </w:p>
-    <w:p>
-      <w:pPr>
-        <w:spacing w:after="60"/>
-        <w:ind w:left="340" w:hanging="340"/>
-      </w:pPr>
-      <w:r>
-        <w:rPr>
-          <w:rFonts w:ascii="Times New Roman" w:cs="Times New Roman" w:eastAsia="Times New Roman" w:hAnsi="Times New Roman"/>
-          <w:b w:val="false"/>
-          <w:bCs w:val="false"/>
-          <w:i w:val="false"/>
-          <w:iCs w:val="false"/>
-          <w:sz w:val="18"/>
-          <w:szCs w:val="18"/>
-          <w:shd w:fill="FFFF00" w:color="auto" w:val="clear"/>
-        </w:rPr>
-        <w:t xml:space="preserve">9. Check the IREA author guidelines for the page limit, figure resolution and reference style before submission.</w:t>
+        <w:t xml:space="preserve">8. Check the IREA author guidelines for the page limit, figure resolution and reference style before submission.</w:t>
       </w:r>
     </w:p>
     <w:p>
@@ -402,7 +383,7 @@
           <w:sz w:val="20"/>
           <w:szCs w:val="20"/>
         </w:rPr>
-        <w:t xml:space="preserve">Reinforcement learning is increasingly proposed for scheduling the virtual inertia and damping of grid-forming battery converters, yet the benefit of such scheduling in a particular microgrid is seldom bounded before agents are trained. This paper bounds it for an isolated 2 MVA microgrid in which a 0.5 MW diesel generator is the only source of physical inertia and a 0.5 MW / 2 MWh battery, with a de-loaded 0.8 MW photovoltaic plant, supplies synthetic inertia through a virtual synchronous generator; a 1 MW wind turbine completes the system. Operating points are derived from one year of hourly ERA5 wind and NASA POWER solar data for Nakhon Ratchasima, Thailand. A per-scenario oracle shows that adapting the virtual inertia and damping can improve the control objective by at most 2.1 % over the best fixed setting. A direction-aware headroom projection, which sizes the damping and inertial commitments at the instants their power peaks, cuts the time a learned TD3 policy spends on undeliverable commitments from 5.07 s to 0.02 s per 30 s episode, and scaling both parameters by one factor reduces converter saturation further than clipping each. Residual TD3 and DDPG agents (5 seeds × 1000 episodes) do not exceed a validation-tuned fixed setting on the overall objective. A three-phase electromagnetic-transient model reproduces the averaged-model frequency trajectories within 0.014–0.018 Hz RMS and shows that phase jumps at load steps raise the 100 ms rate of change of frequency measured by a phase-locked loop by a factor of about 2.5.</w:t>
+        <w:t xml:space="preserve">Reinforcement learning is increasingly proposed for scheduling the virtual inertia and damping of grid-forming battery converters, yet the benefit of such scheduling in a particular microgrid is seldom bounded before agents are trained. This paper bounds it for an isolated 2 MVA microgrid in which a 0.5 MW diesel generator is the only source of physical inertia and a 0.5 MW / 2 MWh battery, with a de-loaded 0.8 MW photovoltaic plant, supplies synthetic inertia through a virtual synchronous generator; a 1 MW wind turbine completes the system. Operating points are derived from one year of hourly ERA5 wind and NASA POWER solar data for Nakhon Ratchasima, Thailand. A per-scenario oracle shows that adapting the virtual inertia and damping can improve the control objective by at most 2.1 % over the best fixed setting. A direction-aware headroom projection, which sizes the damping and inertial commitments at the instants their power peaks, cuts the time a learned TD3 policy spends on undeliverable commitments from 5.07 s to 0.02 s per 30 s episode, and scaling both parameters by one factor reduces converter saturation further than clipping each. Residual TD3 and DDPG agents (5 seeds × 1000 episodes) do not exceed a validation-tuned fixed setting on the overall objective. A three-phase electromagnetic-transient model reproduces the averaged-model frequency trajectories within 0.013–0.017 Hz RMS and shows that phase jumps at load steps raise the 100 ms rate of change of frequency measured by a phase-locked loop by a factor of about 2.5.</w:t>
       </w:r>
     </w:p>
     <w:p>
@@ -13169,7 +13150,7 @@
           <w:sz w:val="20"/>
           <w:szCs w:val="20"/>
         </w:rPr>
-        <w:t xml:space="preserve">The results below were obtained with a fixed-step script solver of the same three-phase circuit; the Simscape Electrical model built from the same files is provided for confirmation in MATLAB R2021a.</w:t>
+        <w:t xml:space="preserve">The model was built and solved in Simscape Electrical (Specialized Power Systems, discrete 100 µs) in MATLAB R2021a; an independent fixed-step script solver of the same circuit agrees with it within about 2 % on every metric.</w:t>
       </w:r>
     </w:p>
     <w:p>
@@ -13195,7 +13176,7 @@
           <w:sz w:val="20"/>
           <w:szCs w:val="20"/>
         </w:rPr>
-        <w:t xml:space="preserve">0.014–0.018</w:t>
+        <w:t xml:space="preserve">0.013–0.017</w:t>
       </w:r>
       <w:r>
         <w:rPr>
@@ -13205,7 +13186,7 @@
           <w:sz w:val="20"/>
           <w:szCs w:val="20"/>
         </w:rPr>
-        <w:t xml:space="preserve"> Hz (Fig. 7, Table VII). The worst-event nadir agrees within 0.2 % for both fixed controllers and is 4 % deeper for the TD3 policy (0.521 against 0.502 Hz), and the BESS energy agrees within 0.8 %. The largest RoCoF over 100 ms is about </w:t>
+        <w:t xml:space="preserve"> Hz (Fig. 7, Table VII). The worst-event nadir agrees within 2 % (0.531 against 0.540 Hz for the tuned setting and 0.512 against 0.502 Hz for TD3), and the BESS energy within 1.1 %. The largest RoCoF over 100 ms is about </w:t>
       </w:r>
       <w:r>
         <w:rPr>
@@ -13225,7 +13206,7 @@
           <w:sz w:val="20"/>
           <w:szCs w:val="20"/>
         </w:rPr>
-        <w:t xml:space="preserve"> times higher in the EMT model: at each load step the bus-voltage phase jumps by roughly 3° because the step current flows through the coupling reactances, and the PLL reads this phase jump as a brief frequency spike, which the averaged model cannot represent. Over a 500 ms window, the window commonly used for RoCoF protection, the difference reduces to between +3 % and +11 %; the RoCoF of the diesel rotor itself, a physical quantity without phase-jump content, is 2.4 Hz/s over 100 ms. The projected controllers keep infeasible commitments at </w:t>
+        <w:t xml:space="preserve"> times higher in the EMT model: at each load step the bus-voltage phase jumps by roughly 3° because the step current flows through the coupling reactances, and the PLL reads this phase jump as a brief frequency spike, which the averaged model cannot represent. Over a 500 ms window, the window commonly used for RoCoF protection, the difference reduces to between −0.5 % and +9 %; the RoCoF of the diesel rotor itself, a physical quantity without phase-jump content, is 2.2 Hz/s over 100 ms. The projected controllers keep infeasible commitments at </w:t>
       </w:r>
       <w:r>
         <w:rPr>
@@ -13245,7 +13226,7 @@
           <w:sz w:val="20"/>
           <w:szCs w:val="20"/>
         </w:rPr>
-        <w:t xml:space="preserve"> per episode in the EMT model. Converter saturation is the one metric that the averaged model clearly underestimates: in the EMT model the power limiter acts on measured power, which includes the electromagnetic transient in the first cycles after each step, and it is active 2.3–2.7 times longer (0.29–0.40 s against 0.11–0.17 s per episode). The ordering of the three controllers is the same in both models for every metric.</w:t>
+        <w:t xml:space="preserve"> per episode in the EMT model. Converter saturation is the one metric that the averaged model clearly underestimates: in the EMT model the power limiter acts on measured power, which includes the electromagnetic transient in the first cycles after each step, and it is active 2.2–2.8 times longer (0.30–0.38 s against 0.11–0.17 s per episode). The ordering of the three controllers is the same in both models for every metric.</w:t>
       </w:r>
     </w:p>
     <w:p>
@@ -13705,7 +13686,7 @@
                 <w:sz w:val="16"/>
                 <w:szCs w:val="16"/>
               </w:rPr>
-              <w:t xml:space="preserve">0.014–0.018 Hz</w:t>
+              <w:t xml:space="preserve">0.013–0.017 Hz</w:t>
             </w:r>
           </w:p>
         </w:tc>
@@ -13807,7 +13788,7 @@
                 <w:sz w:val="16"/>
                 <w:szCs w:val="16"/>
               </w:rPr>
-              <w:t xml:space="preserve">fixed: within 0.2 %; TD3: 4 % deeper</w:t>
+              <w:t xml:space="preserve">within 2 % (fixed and TD3)</w:t>
             </w:r>
           </w:p>
         </w:tc>
@@ -13909,7 +13890,7 @@
                 <w:sz w:val="16"/>
                 <w:szCs w:val="16"/>
               </w:rPr>
-              <w:t xml:space="preserve">within 0.8 %</w:t>
+              <w:t xml:space="preserve">within 1.1 %</w:t>
             </w:r>
           </w:p>
         </w:tc>
@@ -14011,7 +13992,7 @@
                 <w:sz w:val="16"/>
                 <w:szCs w:val="16"/>
               </w:rPr>
-              <w:t xml:space="preserve">×2.5 / +3 to +11 %</w:t>
+              <w:t xml:space="preserve">×2.5 / −0.5 to +9 %</w:t>
             </w:r>
           </w:p>
         </w:tc>
@@ -14113,7 +14094,7 @@
                 <w:sz w:val="16"/>
                 <w:szCs w:val="16"/>
               </w:rPr>
-              <w:t xml:space="preserve">×2.3–2.7 (same ordering)</w:t>
+              <w:t xml:space="preserve">×2.2–2.8 (same ordering)</w:t>
             </w:r>
           </w:p>
         </w:tc>
@@ -14246,9 +14227,9 @@
       <w:r>
         <w:drawing>
           <wp:inline distT="0" distB="0" distL="0" distR="0">
-            <wp:extent cx="5667375" cy="2628900"/>
+            <wp:extent cx="5667375" cy="4029075"/>
             <wp:effectExtent t="0" r="0" b="0" l="0"/>
-            <wp:docPr id="1" name="fig_emt_validation.png" descr="Fig. 7. Averaged (RMS) model and three-phase EMT model for test scenario 1: frequency deviation and VSG power for the three controllers." title="Fig. 7. Averaged (RMS) model and three-p"/>
+            <wp:docPr id="1" name="fig_simscape_sc1.png" descr="Fig. 7. Averaged (RMS) model and three-phase Simscape Electrical model for test scenario 1: frequency deviation and VSG power for the three controllers (MATLAB R2021a)." title="Fig. 7. Averaged (RMS) model and three-p"/>
             <wp:cNvGraphicFramePr>
               <a:graphicFrameLocks xmlns:a="http://schemas.openxmlformats.org/drawingml/2006/main" noChangeAspect="1"/>
             </wp:cNvGraphicFramePr>
@@ -14271,7 +14252,7 @@
                   <pic:spPr bwMode="auto">
                     <a:xfrm>
                       <a:off x="0" y="0"/>
-                      <a:ext cx="5667375" cy="2628900"/>
+                      <a:ext cx="5667375" cy="4029075"/>
                     </a:xfrm>
                     <a:prstGeom prst="rect">
                       <a:avLst/>
@@ -14297,7 +14278,7 @@
           <w:sz w:val="16"/>
           <w:szCs w:val="16"/>
         </w:rPr>
-        <w:t xml:space="preserve">Fig. 7. Averaged (RMS) model and three-phase EMT model for test scenario 1: frequency deviation and VSG power for the three controllers.</w:t>
+        <w:t xml:space="preserve">Fig. 7. Averaged (RMS) model and three-phase Simscape Electrical model for test scenario 1: frequency deviation and VSG power for the three controllers (MATLAB R2021a).</w:t>
       </w:r>
     </w:p>
     <w:p>
@@ -14466,20 +14447,7 @@
           <w:sz w:val="20"/>
           <w:szCs w:val="20"/>
         </w:rPr>
-        <w:t xml:space="preserve">The network is a single bus, the load profile is synthetic, and one site and one year are used. The EMT model represents the converter by its average model and the diesel unit by a classical machine model; switching effects, inner current loops, the excitation system and protection are not modelled. </w:t>
-      </w:r>
-      <w:r>
-        <w:rPr>
-          <w:rFonts w:ascii="Times New Roman" w:cs="Times New Roman" w:eastAsia="Times New Roman" w:hAnsi="Times New Roman"/>
-          <w:b w:val="false"/>
-          <w:bCs w:val="false"/>
-          <w:i w:val="false"/>
-          <w:iCs w:val="false"/>
-          <w:sz w:val="20"/>
-          <w:szCs w:val="20"/>
-          <w:shd w:fill="FFFF00" w:color="auto" w:val="clear"/>
-        </w:rPr>
-        <w:t xml:space="preserve">[AUTHOR: state whether the Simscape Electrical model in MATLAB R2021a confirmed the script-solver results]</w:t>
+        <w:t xml:space="preserve">The network is a single bus, the load profile is synthetic, and one site and one year are used. The EMT model represents the converter by its average model and the diesel unit by a classical machine model; switching effects, inner current loops, the excitation system and protection are not modelled; hardware-in-the-loop tests remain to be carried out.</w:t>
       </w:r>
     </w:p>
     <w:p>

</xml_diff>

<commit_message>
IREA manuscript: add comparison with published studies (highlighted for review)
Adds a sentence on fixed-at-design-time limits to Section II, a Discussion
paragraph and Table VIII comparing test conditions and reported results of
the closest studies, and reference [32] (Egbomwan et al., 2025). All
additions are highlighted in yellow for the authors' review.

Co-Authored-By: Claude Opus 5.5 <noreply@anthropic.com>
Claude-Session: https://claude.ai/code/session_01FcrrmkJTVMUBqnhfmaF7Pm
</commit_message>
<xml_diff>
--- a/paper/IREA_manuscript_PWP.docx
+++ b/paper/IREA_manuscript_PWP.docx
@@ -170,7 +170,26 @@
           <w:szCs w:val="18"/>
           <w:shd w:fill="FFFF00" w:color="auto" w:val="clear"/>
         </w:rPr>
-        <w:t xml:space="preserve">8. Check the IREA author guidelines for the page limit, figure resolution and reference style before submission.</w:t>
+        <w:t xml:space="preserve">8. Review the literature comparison added in yellow (end of Section II, Discussion paragraph, Table VIII, reference [32]) and remove the highlight from what you accept.</w:t>
+      </w:r>
+    </w:p>
+    <w:p>
+      <w:pPr>
+        <w:spacing w:after="60"/>
+        <w:ind w:left="340" w:hanging="340"/>
+      </w:pPr>
+      <w:r>
+        <w:rPr>
+          <w:rFonts w:ascii="Times New Roman" w:cs="Times New Roman" w:eastAsia="Times New Roman" w:hAnsi="Times New Roman"/>
+          <w:b w:val="false"/>
+          <w:bCs w:val="false"/>
+          <w:i w:val="false"/>
+          <w:iCs w:val="false"/>
+          <w:sz w:val="18"/>
+          <w:szCs w:val="18"/>
+          <w:shd w:fill="FFFF00" w:color="auto" w:val="clear"/>
+        </w:rPr>
+        <w:t xml:space="preserve">9. Check the IREA author guidelines for the page limit, figure resolution and reference style before submission.</w:t>
       </w:r>
     </w:p>
     <w:p>
@@ -1438,6 +1457,19 @@
           <w:szCs w:val="20"/>
         </w:rPr>
         <w:t xml:space="preserve">The synchronverter reproduces the machine equations inside the converter controller [3], and VSG variants are reviewed in [4]. Rule-based schemes alternate the inertia according to the direction of the rotor swing [5], adapt inertia and damping together [6], [7] or respect SoC limits [8]. Learning-based schemes tune droop, inertia and damping with DDPG [9], soft actor–critic [10] or TD3 [11], [12], including real-time simulator validation [12], and recent comparisons cover several algorithms and benchmark controllers [13], [14]; a broader review of RL in power-system control is given in [31]. Converter current limiting bounds what a grid-forming controller can deliver [29], [30], but most adaptive formulations bound the parameters only by fixed ranges. The studies in [15], [16] add a headroom requirement for converter-only microgrids; none of the cited works bounds the achievable gain of adaptation in advance or validates a learned VSG schedule in a circuit-level model of a hybrid diesel–VSG system.</w:t>
+      </w:r>
+      <w:r>
+        <w:rPr>
+          <w:rFonts w:ascii="Times New Roman" w:cs="Times New Roman" w:eastAsia="Times New Roman" w:hAnsi="Times New Roman"/>
+          <w:b w:val="false"/>
+          <w:bCs w:val="false"/>
+          <w:i w:val="false"/>
+          <w:iCs w:val="false"/>
+          <w:sz w:val="20"/>
+          <w:szCs w:val="20"/>
+          <w:shd w:fill="FFFF00" w:color="auto" w:val="clear"/>
+        </w:rPr>
+        <w:t xml:space="preserve"> The limits that do appear are fixed at design time: a bound on the inertia from the rated power [7], a region of inertia and damping derived from a damping-ratio range [10], fixed bounds on the inertia power in a predictive safety filter [32] and SoC-dependent inertia [8]. None of them follows the power that the converter has already committed to the energy-management dispatch.</w:t>
       </w:r>
     </w:p>
     <w:p>
@@ -14408,6 +14440,2370 @@
           <w:iCs w:val="false"/>
           <w:sz w:val="20"/>
           <w:szCs w:val="20"/>
+          <w:shd w:fill="FFFF00" w:color="auto" w:val="clear"/>
+        </w:rPr>
+        <w:t xml:space="preserve">Comparison with published studies. </w:t>
+      </w:r>
+      <w:r>
+        <w:rPr>
+          <w:rFonts w:ascii="Times New Roman" w:cs="Times New Roman" w:eastAsia="Times New Roman" w:hAnsi="Times New Roman"/>
+          <w:b w:val="false"/>
+          <w:bCs w:val="false"/>
+          <w:i w:val="false"/>
+          <w:iCs w:val="false"/>
+          <w:sz w:val="20"/>
+          <w:szCs w:val="20"/>
+          <w:shd w:fill="FFFF00" w:color="auto" w:val="clear"/>
+        </w:rPr>
+        <w:t xml:space="preserve">Table VIII lists the test conditions and reported results of the closest studies, each against its own reference. The published improvements in frequency deviation, 33–60 %, are measured against fixed-parameter VSGs or PI controllers, with one trained agent or rule design per study and one to three disturbances; only [13] tunes a baseline, its rule-based controller, by grid search. Against a validation-tuned fixed VSG over 200 test scenarios and five seeds, TD3 lowers the nadir in this study by 9 %, and the oracle shows that no scheduler could improve the objective by more than 2.1 %. Because systems, disturbances and baselines differ, the table cannot rank the controllers; it shows how strongly a reported gain depends on its reference. None of the listed studies measures whether the scheduled inertia and damping are deliverable, so the feasibility result of Table VI has no published counterpart. Two studies validate beyond software simulation, with hardware-in-the-loop [8] or a real-time digital simulator [12], which remains to be done for the present controllers.</w:t>
+      </w:r>
+    </w:p>
+    <w:p>
+      <w:pPr>
+        <w:sectPr>
+          <w:type w:val="continuous"/>
+          <w:pgSz w:w="11906" w:h="16838" w:orient="portrait"/>
+          <w:pgMar w:top="1383" w:right="850" w:bottom="1701" w:left="1417" w:header="312" w:footer="1134" w:gutter="0"/>
+          <w:pgNumType/>
+          <w:cols w:space="567" w:num="2"/>
+          <w:docGrid w:linePitch="360"/>
+        </w:sectPr>
+      </w:pPr>
+    </w:p>
+    <w:p>
+      <w:pPr>
+        <w:keepNext/>
+        <w:keepLines/>
+        <w:spacing w:after="80" w:before="200"/>
+        <w:jc w:val="center"/>
+      </w:pPr>
+      <w:r>
+        <w:rPr>
+          <w:rFonts w:ascii="Times New Roman" w:cs="Times New Roman" w:eastAsia="Times New Roman" w:hAnsi="Times New Roman"/>
+          <w:sz w:val="16"/>
+          <w:szCs w:val="16"/>
+          <w:shd w:fill="FFFF00" w:color="auto" w:val="clear"/>
+        </w:rPr>
+        <w:t xml:space="preserve">TABLE VIII</w:t>
+      </w:r>
+      <w:r>
+        <w:rPr>
+          <w:rFonts w:ascii="Times New Roman" w:cs="Times New Roman" w:eastAsia="Times New Roman" w:hAnsi="Times New Roman"/>
+          <w:sz w:val="16"/>
+          <w:szCs w:val="16"/>
+          <w:shd w:fill="FFFF00" w:color="auto" w:val="clear"/>
+        </w:rPr>
+        <w:br/>
+        <w:t xml:space="preserve">TEST CONDITIONS AND REPORTED RESULTS OF RELATED STUDIES (EACH AGAINST ITS OWN REFERENCE)</w:t>
+      </w:r>
+    </w:p>
+    <w:tbl>
+      <w:tblPr>
+        <w:tblW w:type="dxa" w:w="9639"/>
+        <w:tblBorders>
+          <w:top w:val="single" w:color="auto" w:sz="4"/>
+          <w:left w:val="single" w:color="auto" w:sz="4"/>
+          <w:bottom w:val="single" w:color="auto" w:sz="4"/>
+          <w:right w:val="single" w:color="auto" w:sz="4"/>
+          <w:insideH w:val="single" w:color="auto" w:sz="4"/>
+          <w:insideV w:val="single" w:color="auto" w:sz="4"/>
+        </w:tblBorders>
+      </w:tblPr>
+      <w:tblGrid>
+        <w:gridCol w:w="1000"/>
+        <w:gridCol w:w="2150"/>
+        <w:gridCol w:w="1300"/>
+        <w:gridCol w:w="1500"/>
+        <w:gridCol w:w="2100"/>
+        <w:gridCol w:w="1589"/>
+      </w:tblGrid>
+      <w:tr>
+        <w:trPr>
+          <w:cantSplit/>
+          <w:tblHeader/>
+        </w:trPr>
+        <w:tc>
+          <w:tcPr>
+            <w:tcW w:type="dxa" w:w="1000"/>
+            <w:tcBorders>
+              <w:top w:val="single" w:color="000000" w:sz="4"/>
+              <w:left w:val="single" w:color="000000" w:sz="4"/>
+              <w:bottom w:val="single" w:color="000000" w:sz="4"/>
+              <w:right w:val="single" w:color="000000" w:sz="4"/>
+            </w:tcBorders>
+            <w:tcMar>
+              <w:top w:type="dxa" w:w="30"/>
+              <w:left w:type="dxa" w:w="60"/>
+              <w:bottom w:type="dxa" w:w="30"/>
+              <w:right w:type="dxa" w:w="60"/>
+            </w:tcMar>
+          </w:tcPr>
+          <w:p>
+            <w:pPr>
+              <w:jc w:val="left"/>
+            </w:pPr>
+            <w:r>
+              <w:rPr>
+                <w:rFonts w:ascii="Times New Roman" w:cs="Times New Roman" w:eastAsia="Times New Roman" w:hAnsi="Times New Roman"/>
+                <w:b/>
+                <w:bCs/>
+                <w:sz w:val="16"/>
+                <w:szCs w:val="16"/>
+              </w:rPr>
+              <w:t xml:space="preserve">Ref.</w:t>
+            </w:r>
+          </w:p>
+        </w:tc>
+        <w:tc>
+          <w:tcPr>
+            <w:tcW w:type="dxa" w:w="2150"/>
+            <w:tcBorders>
+              <w:top w:val="single" w:color="000000" w:sz="4"/>
+              <w:left w:val="single" w:color="000000" w:sz="4"/>
+              <w:bottom w:val="single" w:color="000000" w:sz="4"/>
+              <w:right w:val="single" w:color="000000" w:sz="4"/>
+            </w:tcBorders>
+            <w:tcMar>
+              <w:top w:type="dxa" w:w="30"/>
+              <w:left w:type="dxa" w:w="60"/>
+              <w:bottom w:type="dxa" w:w="30"/>
+              <w:right w:type="dxa" w:w="60"/>
+            </w:tcMar>
+          </w:tcPr>
+          <w:p>
+            <w:pPr>
+              <w:jc w:val="left"/>
+            </w:pPr>
+            <w:r>
+              <w:rPr>
+                <w:rFonts w:ascii="Times New Roman" w:cs="Times New Roman" w:eastAsia="Times New Roman" w:hAnsi="Times New Roman"/>
+                <w:b/>
+                <w:bCs/>
+                <w:sz w:val="16"/>
+                <w:szCs w:val="16"/>
+              </w:rPr>
+              <w:t xml:space="preserve">Test system</w:t>
+            </w:r>
+          </w:p>
+        </w:tc>
+        <w:tc>
+          <w:tcPr>
+            <w:tcW w:type="dxa" w:w="1300"/>
+            <w:tcBorders>
+              <w:top w:val="single" w:color="000000" w:sz="4"/>
+              <w:left w:val="single" w:color="000000" w:sz="4"/>
+              <w:bottom w:val="single" w:color="000000" w:sz="4"/>
+              <w:right w:val="single" w:color="000000" w:sz="4"/>
+            </w:tcBorders>
+            <w:tcMar>
+              <w:top w:type="dxa" w:w="30"/>
+              <w:left w:type="dxa" w:w="60"/>
+              <w:bottom w:type="dxa" w:w="30"/>
+              <w:right w:type="dxa" w:w="60"/>
+            </w:tcMar>
+          </w:tcPr>
+          <w:p>
+            <w:pPr>
+              <w:jc w:val="left"/>
+            </w:pPr>
+            <w:r>
+              <w:rPr>
+                <w:rFonts w:ascii="Times New Roman" w:cs="Times New Roman" w:eastAsia="Times New Roman" w:hAnsi="Times New Roman"/>
+                <w:b/>
+                <w:bCs/>
+                <w:sz w:val="16"/>
+                <w:szCs w:val="16"/>
+              </w:rPr>
+              <w:t xml:space="preserve">Validation</w:t>
+            </w:r>
+          </w:p>
+        </w:tc>
+        <w:tc>
+          <w:tcPr>
+            <w:tcW w:type="dxa" w:w="1500"/>
+            <w:tcBorders>
+              <w:top w:val="single" w:color="000000" w:sz="4"/>
+              <w:left w:val="single" w:color="000000" w:sz="4"/>
+              <w:bottom w:val="single" w:color="000000" w:sz="4"/>
+              <w:right w:val="single" w:color="000000" w:sz="4"/>
+            </w:tcBorders>
+            <w:tcMar>
+              <w:top w:type="dxa" w:w="30"/>
+              <w:left w:type="dxa" w:w="60"/>
+              <w:bottom w:type="dxa" w:w="30"/>
+              <w:right w:type="dxa" w:w="60"/>
+            </w:tcMar>
+          </w:tcPr>
+          <w:p>
+            <w:pPr>
+              <w:jc w:val="left"/>
+            </w:pPr>
+            <w:r>
+              <w:rPr>
+                <w:rFonts w:ascii="Times New Roman" w:cs="Times New Roman" w:eastAsia="Times New Roman" w:hAnsi="Times New Roman"/>
+                <w:b/>
+                <w:bCs/>
+                <w:sz w:val="16"/>
+                <w:szCs w:val="16"/>
+              </w:rPr>
+              <w:t xml:space="preserve">Reference controller</w:t>
+            </w:r>
+          </w:p>
+        </w:tc>
+        <w:tc>
+          <w:tcPr>
+            <w:tcW w:type="dxa" w:w="2100"/>
+            <w:tcBorders>
+              <w:top w:val="single" w:color="000000" w:sz="4"/>
+              <w:left w:val="single" w:color="000000" w:sz="4"/>
+              <w:bottom w:val="single" w:color="000000" w:sz="4"/>
+              <w:right w:val="single" w:color="000000" w:sz="4"/>
+            </w:tcBorders>
+            <w:tcMar>
+              <w:top w:type="dxa" w:w="30"/>
+              <w:left w:type="dxa" w:w="60"/>
+              <w:bottom w:type="dxa" w:w="30"/>
+              <w:right w:type="dxa" w:w="60"/>
+            </w:tcMar>
+          </w:tcPr>
+          <w:p>
+            <w:pPr>
+              <w:jc w:val="left"/>
+            </w:pPr>
+            <w:r>
+              <w:rPr>
+                <w:rFonts w:ascii="Times New Roman" w:cs="Times New Roman" w:eastAsia="Times New Roman" w:hAnsi="Times New Roman"/>
+                <w:b/>
+                <w:bCs/>
+                <w:sz w:val="16"/>
+                <w:szCs w:val="16"/>
+              </w:rPr>
+              <w:t xml:space="preserve">Reported result</w:t>
+            </w:r>
+          </w:p>
+        </w:tc>
+        <w:tc>
+          <w:tcPr>
+            <w:tcW w:type="dxa" w:w="1589"/>
+            <w:tcBorders>
+              <w:top w:val="single" w:color="000000" w:sz="4"/>
+              <w:left w:val="single" w:color="000000" w:sz="4"/>
+              <w:bottom w:val="single" w:color="000000" w:sz="4"/>
+              <w:right w:val="single" w:color="000000" w:sz="4"/>
+            </w:tcBorders>
+            <w:tcMar>
+              <w:top w:type="dxa" w:w="30"/>
+              <w:left w:type="dxa" w:w="60"/>
+              <w:bottom w:type="dxa" w:w="30"/>
+              <w:right w:type="dxa" w:w="60"/>
+            </w:tcMar>
+          </w:tcPr>
+          <w:p>
+            <w:pPr>
+              <w:jc w:val="left"/>
+            </w:pPr>
+            <w:r>
+              <w:rPr>
+                <w:rFonts w:ascii="Times New Roman" w:cs="Times New Roman" w:eastAsia="Times New Roman" w:hAnsi="Times New Roman"/>
+                <w:b/>
+                <w:bCs/>
+                <w:sz w:val="16"/>
+                <w:szCs w:val="16"/>
+              </w:rPr>
+              <w:t xml:space="preserve">Capability check</w:t>
+            </w:r>
+          </w:p>
+        </w:tc>
+      </w:tr>
+      <w:tr>
+        <w:trPr>
+          <w:cantSplit/>
+          <w:tblHeader w:val="false"/>
+        </w:trPr>
+        <w:tc>
+          <w:tcPr>
+            <w:tcW w:type="dxa" w:w="1000"/>
+            <w:tcBorders>
+              <w:top w:val="single" w:color="000000" w:sz="4"/>
+              <w:left w:val="single" w:color="000000" w:sz="4"/>
+              <w:bottom w:val="single" w:color="000000" w:sz="4"/>
+              <w:right w:val="single" w:color="000000" w:sz="4"/>
+            </w:tcBorders>
+            <w:shd w:fill="FFFF00" w:color="auto" w:val="clear"/>
+            <w:tcMar>
+              <w:top w:type="dxa" w:w="30"/>
+              <w:left w:type="dxa" w:w="60"/>
+              <w:bottom w:type="dxa" w:w="30"/>
+              <w:right w:type="dxa" w:w="60"/>
+            </w:tcMar>
+          </w:tcPr>
+          <w:p>
+            <w:pPr>
+              <w:jc w:val="left"/>
+            </w:pPr>
+            <w:r>
+              <w:rPr>
+                <w:rFonts w:ascii="Times New Roman" w:cs="Times New Roman" w:eastAsia="Times New Roman" w:hAnsi="Times New Roman"/>
+                <w:b w:val="false"/>
+                <w:bCs w:val="false"/>
+                <w:sz w:val="16"/>
+                <w:szCs w:val="16"/>
+              </w:rPr>
+              <w:t xml:space="preserve">[6] rule</w:t>
+            </w:r>
+          </w:p>
+        </w:tc>
+        <w:tc>
+          <w:tcPr>
+            <w:tcW w:type="dxa" w:w="2150"/>
+            <w:tcBorders>
+              <w:top w:val="single" w:color="000000" w:sz="4"/>
+              <w:left w:val="single" w:color="000000" w:sz="4"/>
+              <w:bottom w:val="single" w:color="000000" w:sz="4"/>
+              <w:right w:val="single" w:color="000000" w:sz="4"/>
+            </w:tcBorders>
+            <w:shd w:fill="FFFF00" w:color="auto" w:val="clear"/>
+            <w:tcMar>
+              <w:top w:type="dxa" w:w="30"/>
+              <w:left w:type="dxa" w:w="60"/>
+              <w:bottom w:type="dxa" w:w="30"/>
+              <w:right w:type="dxa" w:w="60"/>
+            </w:tcMar>
+          </w:tcPr>
+          <w:p>
+            <w:pPr>
+              <w:jc w:val="left"/>
+            </w:pPr>
+            <w:r>
+              <w:rPr>
+                <w:rFonts w:ascii="Times New Roman" w:cs="Times New Roman" w:eastAsia="Times New Roman" w:hAnsi="Times New Roman"/>
+                <w:b w:val="false"/>
+                <w:bCs w:val="false"/>
+                <w:sz w:val="16"/>
+                <w:szCs w:val="16"/>
+              </w:rPr>
+              <w:t xml:space="preserve">Single VSG, 50 kW load shedding</w:t>
+            </w:r>
+          </w:p>
+        </w:tc>
+        <w:tc>
+          <w:tcPr>
+            <w:tcW w:type="dxa" w:w="1300"/>
+            <w:tcBorders>
+              <w:top w:val="single" w:color="000000" w:sz="4"/>
+              <w:left w:val="single" w:color="000000" w:sz="4"/>
+              <w:bottom w:val="single" w:color="000000" w:sz="4"/>
+              <w:right w:val="single" w:color="000000" w:sz="4"/>
+            </w:tcBorders>
+            <w:shd w:fill="FFFF00" w:color="auto" w:val="clear"/>
+            <w:tcMar>
+              <w:top w:type="dxa" w:w="30"/>
+              <w:left w:type="dxa" w:w="60"/>
+              <w:bottom w:type="dxa" w:w="30"/>
+              <w:right w:type="dxa" w:w="60"/>
+            </w:tcMar>
+          </w:tcPr>
+          <w:p>
+            <w:pPr>
+              <w:jc w:val="left"/>
+            </w:pPr>
+            <w:r>
+              <w:rPr>
+                <w:rFonts w:ascii="Times New Roman" w:cs="Times New Roman" w:eastAsia="Times New Roman" w:hAnsi="Times New Roman"/>
+                <w:b w:val="false"/>
+                <w:bCs w:val="false"/>
+                <w:sz w:val="16"/>
+                <w:szCs w:val="16"/>
+              </w:rPr>
+              <w:t xml:space="preserve">Simulink</w:t>
+            </w:r>
+          </w:p>
+        </w:tc>
+        <w:tc>
+          <w:tcPr>
+            <w:tcW w:type="dxa" w:w="1500"/>
+            <w:tcBorders>
+              <w:top w:val="single" w:color="000000" w:sz="4"/>
+              <w:left w:val="single" w:color="000000" w:sz="4"/>
+              <w:bottom w:val="single" w:color="000000" w:sz="4"/>
+              <w:right w:val="single" w:color="000000" w:sz="4"/>
+            </w:tcBorders>
+            <w:shd w:fill="FFFF00" w:color="auto" w:val="clear"/>
+            <w:tcMar>
+              <w:top w:type="dxa" w:w="30"/>
+              <w:left w:type="dxa" w:w="60"/>
+              <w:bottom w:type="dxa" w:w="30"/>
+              <w:right w:type="dxa" w:w="60"/>
+            </w:tcMar>
+          </w:tcPr>
+          <w:p>
+            <w:pPr>
+              <w:jc w:val="left"/>
+            </w:pPr>
+            <w:r>
+              <w:rPr>
+                <w:rFonts w:ascii="Times New Roman" w:cs="Times New Roman" w:eastAsia="Times New Roman" w:hAnsi="Times New Roman"/>
+                <w:b w:val="false"/>
+                <w:bCs w:val="false"/>
+                <w:sz w:val="16"/>
+                <w:szCs w:val="16"/>
+              </w:rPr>
+              <w:t xml:space="preserve">Constant parameters</w:t>
+            </w:r>
+          </w:p>
+        </w:tc>
+        <w:tc>
+          <w:tcPr>
+            <w:tcW w:type="dxa" w:w="2100"/>
+            <w:tcBorders>
+              <w:top w:val="single" w:color="000000" w:sz="4"/>
+              <w:left w:val="single" w:color="000000" w:sz="4"/>
+              <w:bottom w:val="single" w:color="000000" w:sz="4"/>
+              <w:right w:val="single" w:color="000000" w:sz="4"/>
+            </w:tcBorders>
+            <w:shd w:fill="FFFF00" w:color="auto" w:val="clear"/>
+            <w:tcMar>
+              <w:top w:type="dxa" w:w="30"/>
+              <w:left w:type="dxa" w:w="60"/>
+              <w:bottom w:type="dxa" w:w="30"/>
+              <w:right w:type="dxa" w:w="60"/>
+            </w:tcMar>
+          </w:tcPr>
+          <w:p>
+            <w:pPr>
+              <w:jc w:val="left"/>
+            </w:pPr>
+            <w:r>
+              <w:rPr>
+                <w:rFonts w:ascii="Times New Roman" w:cs="Times New Roman" w:eastAsia="Times New Roman" w:hAnsi="Times New Roman"/>
+                <w:b w:val="false"/>
+                <w:bCs w:val="false"/>
+                <w:sz w:val="16"/>
+                <w:szCs w:val="16"/>
+              </w:rPr>
+              <w:t xml:space="preserve">Δf 0.75 → 0.45 Hz (Fig. 2)</w:t>
+            </w:r>
+          </w:p>
+        </w:tc>
+        <w:tc>
+          <w:tcPr>
+            <w:tcW w:type="dxa" w:w="1589"/>
+            <w:tcBorders>
+              <w:top w:val="single" w:color="000000" w:sz="4"/>
+              <w:left w:val="single" w:color="000000" w:sz="4"/>
+              <w:bottom w:val="single" w:color="000000" w:sz="4"/>
+              <w:right w:val="single" w:color="000000" w:sz="4"/>
+            </w:tcBorders>
+            <w:shd w:fill="FFFF00" w:color="auto" w:val="clear"/>
+            <w:tcMar>
+              <w:top w:type="dxa" w:w="30"/>
+              <w:left w:type="dxa" w:w="60"/>
+              <w:bottom w:type="dxa" w:w="30"/>
+              <w:right w:type="dxa" w:w="60"/>
+            </w:tcMar>
+          </w:tcPr>
+          <w:p>
+            <w:pPr>
+              <w:jc w:val="left"/>
+            </w:pPr>
+            <w:r>
+              <w:rPr>
+                <w:rFonts w:ascii="Times New Roman" w:cs="Times New Roman" w:eastAsia="Times New Roman" w:hAnsi="Times New Roman"/>
+                <w:b w:val="false"/>
+                <w:bCs w:val="false"/>
+                <w:sz w:val="16"/>
+                <w:szCs w:val="16"/>
+              </w:rPr>
+              <w:t xml:space="preserve">–</w:t>
+            </w:r>
+          </w:p>
+        </w:tc>
+      </w:tr>
+      <w:tr>
+        <w:trPr>
+          <w:cantSplit/>
+          <w:tblHeader w:val="false"/>
+        </w:trPr>
+        <w:tc>
+          <w:tcPr>
+            <w:tcW w:type="dxa" w:w="1000"/>
+            <w:tcBorders>
+              <w:top w:val="single" w:color="000000" w:sz="4"/>
+              <w:left w:val="single" w:color="000000" w:sz="4"/>
+              <w:bottom w:val="single" w:color="000000" w:sz="4"/>
+              <w:right w:val="single" w:color="000000" w:sz="4"/>
+            </w:tcBorders>
+            <w:shd w:fill="FFFF00" w:color="auto" w:val="clear"/>
+            <w:tcMar>
+              <w:top w:type="dxa" w:w="30"/>
+              <w:left w:type="dxa" w:w="60"/>
+              <w:bottom w:type="dxa" w:w="30"/>
+              <w:right w:type="dxa" w:w="60"/>
+            </w:tcMar>
+          </w:tcPr>
+          <w:p>
+            <w:pPr>
+              <w:jc w:val="left"/>
+            </w:pPr>
+            <w:r>
+              <w:rPr>
+                <w:rFonts w:ascii="Times New Roman" w:cs="Times New Roman" w:eastAsia="Times New Roman" w:hAnsi="Times New Roman"/>
+                <w:b w:val="false"/>
+                <w:bCs w:val="false"/>
+                <w:sz w:val="16"/>
+                <w:szCs w:val="16"/>
+              </w:rPr>
+              <w:t xml:space="preserve">[7] rule</w:t>
+            </w:r>
+          </w:p>
+        </w:tc>
+        <w:tc>
+          <w:tcPr>
+            <w:tcW w:type="dxa" w:w="2150"/>
+            <w:tcBorders>
+              <w:top w:val="single" w:color="000000" w:sz="4"/>
+              <w:left w:val="single" w:color="000000" w:sz="4"/>
+              <w:bottom w:val="single" w:color="000000" w:sz="4"/>
+              <w:right w:val="single" w:color="000000" w:sz="4"/>
+            </w:tcBorders>
+            <w:shd w:fill="FFFF00" w:color="auto" w:val="clear"/>
+            <w:tcMar>
+              <w:top w:type="dxa" w:w="30"/>
+              <w:left w:type="dxa" w:w="60"/>
+              <w:bottom w:type="dxa" w:w="30"/>
+              <w:right w:type="dxa" w:w="60"/>
+            </w:tcMar>
+          </w:tcPr>
+          <w:p>
+            <w:pPr>
+              <w:jc w:val="left"/>
+            </w:pPr>
+            <w:r>
+              <w:rPr>
+                <w:rFonts w:ascii="Times New Roman" w:cs="Times New Roman" w:eastAsia="Times New Roman" w:hAnsi="Times New Roman"/>
+                <w:b w:val="false"/>
+                <w:bCs w:val="false"/>
+                <w:sz w:val="16"/>
+                <w:szCs w:val="16"/>
+              </w:rPr>
+              <w:t xml:space="preserve">Grid-connected VSG, 15 kW step</w:t>
+            </w:r>
+          </w:p>
+        </w:tc>
+        <w:tc>
+          <w:tcPr>
+            <w:tcW w:type="dxa" w:w="1300"/>
+            <w:tcBorders>
+              <w:top w:val="single" w:color="000000" w:sz="4"/>
+              <w:left w:val="single" w:color="000000" w:sz="4"/>
+              <w:bottom w:val="single" w:color="000000" w:sz="4"/>
+              <w:right w:val="single" w:color="000000" w:sz="4"/>
+            </w:tcBorders>
+            <w:shd w:fill="FFFF00" w:color="auto" w:val="clear"/>
+            <w:tcMar>
+              <w:top w:type="dxa" w:w="30"/>
+              <w:left w:type="dxa" w:w="60"/>
+              <w:bottom w:type="dxa" w:w="30"/>
+              <w:right w:type="dxa" w:w="60"/>
+            </w:tcMar>
+          </w:tcPr>
+          <w:p>
+            <w:pPr>
+              <w:jc w:val="left"/>
+            </w:pPr>
+            <w:r>
+              <w:rPr>
+                <w:rFonts w:ascii="Times New Roman" w:cs="Times New Roman" w:eastAsia="Times New Roman" w:hAnsi="Times New Roman"/>
+                <w:b w:val="false"/>
+                <w:bCs w:val="false"/>
+                <w:sz w:val="16"/>
+                <w:szCs w:val="16"/>
+              </w:rPr>
+              <w:t xml:space="preserve">Simulink</w:t>
+            </w:r>
+          </w:p>
+        </w:tc>
+        <w:tc>
+          <w:tcPr>
+            <w:tcW w:type="dxa" w:w="1500"/>
+            <w:tcBorders>
+              <w:top w:val="single" w:color="000000" w:sz="4"/>
+              <w:left w:val="single" w:color="000000" w:sz="4"/>
+              <w:bottom w:val="single" w:color="000000" w:sz="4"/>
+              <w:right w:val="single" w:color="000000" w:sz="4"/>
+            </w:tcBorders>
+            <w:shd w:fill="FFFF00" w:color="auto" w:val="clear"/>
+            <w:tcMar>
+              <w:top w:type="dxa" w:w="30"/>
+              <w:left w:type="dxa" w:w="60"/>
+              <w:bottom w:type="dxa" w:w="30"/>
+              <w:right w:type="dxa" w:w="60"/>
+            </w:tcMar>
+          </w:tcPr>
+          <w:p>
+            <w:pPr>
+              <w:jc w:val="left"/>
+            </w:pPr>
+            <w:r>
+              <w:rPr>
+                <w:rFonts w:ascii="Times New Roman" w:cs="Times New Roman" w:eastAsia="Times New Roman" w:hAnsi="Times New Roman"/>
+                <w:b w:val="false"/>
+                <w:bCs w:val="false"/>
+                <w:sz w:val="16"/>
+                <w:szCs w:val="16"/>
+              </w:rPr>
+              <w:t xml:space="preserve">Fixed J, D</w:t>
+            </w:r>
+          </w:p>
+        </w:tc>
+        <w:tc>
+          <w:tcPr>
+            <w:tcW w:type="dxa" w:w="2100"/>
+            <w:tcBorders>
+              <w:top w:val="single" w:color="000000" w:sz="4"/>
+              <w:left w:val="single" w:color="000000" w:sz="4"/>
+              <w:bottom w:val="single" w:color="000000" w:sz="4"/>
+              <w:right w:val="single" w:color="000000" w:sz="4"/>
+            </w:tcBorders>
+            <w:shd w:fill="FFFF00" w:color="auto" w:val="clear"/>
+            <w:tcMar>
+              <w:top w:type="dxa" w:w="30"/>
+              <w:left w:type="dxa" w:w="60"/>
+              <w:bottom w:type="dxa" w:w="30"/>
+              <w:right w:type="dxa" w:w="60"/>
+            </w:tcMar>
+          </w:tcPr>
+          <w:p>
+            <w:pPr>
+              <w:jc w:val="left"/>
+            </w:pPr>
+            <w:r>
+              <w:rPr>
+                <w:rFonts w:ascii="Times New Roman" w:cs="Times New Roman" w:eastAsia="Times New Roman" w:hAnsi="Times New Roman"/>
+                <w:b w:val="false"/>
+                <w:bCs w:val="false"/>
+                <w:sz w:val="16"/>
+                <w:szCs w:val="16"/>
+              </w:rPr>
+              <w:t xml:space="preserve">Δf 0.5 → 0.2 Hz</w:t>
+            </w:r>
+          </w:p>
+        </w:tc>
+        <w:tc>
+          <w:tcPr>
+            <w:tcW w:type="dxa" w:w="1589"/>
+            <w:tcBorders>
+              <w:top w:val="single" w:color="000000" w:sz="4"/>
+              <w:left w:val="single" w:color="000000" w:sz="4"/>
+              <w:bottom w:val="single" w:color="000000" w:sz="4"/>
+              <w:right w:val="single" w:color="000000" w:sz="4"/>
+            </w:tcBorders>
+            <w:shd w:fill="FFFF00" w:color="auto" w:val="clear"/>
+            <w:tcMar>
+              <w:top w:type="dxa" w:w="30"/>
+              <w:left w:type="dxa" w:w="60"/>
+              <w:bottom w:type="dxa" w:w="30"/>
+              <w:right w:type="dxa" w:w="60"/>
+            </w:tcMar>
+          </w:tcPr>
+          <w:p>
+            <w:pPr>
+              <w:jc w:val="left"/>
+            </w:pPr>
+            <w:r>
+              <w:rPr>
+                <w:rFonts w:ascii="Times New Roman" w:cs="Times New Roman" w:eastAsia="Times New Roman" w:hAnsi="Times New Roman"/>
+                <w:b w:val="false"/>
+                <w:bCs w:val="false"/>
+                <w:sz w:val="16"/>
+                <w:szCs w:val="16"/>
+              </w:rPr>
+              <w:t xml:space="preserve">Static J bound</w:t>
+            </w:r>
+          </w:p>
+        </w:tc>
+      </w:tr>
+      <w:tr>
+        <w:trPr>
+          <w:cantSplit/>
+          <w:tblHeader w:val="false"/>
+        </w:trPr>
+        <w:tc>
+          <w:tcPr>
+            <w:tcW w:type="dxa" w:w="1000"/>
+            <w:tcBorders>
+              <w:top w:val="single" w:color="000000" w:sz="4"/>
+              <w:left w:val="single" w:color="000000" w:sz="4"/>
+              <w:bottom w:val="single" w:color="000000" w:sz="4"/>
+              <w:right w:val="single" w:color="000000" w:sz="4"/>
+            </w:tcBorders>
+            <w:shd w:fill="FFFF00" w:color="auto" w:val="clear"/>
+            <w:tcMar>
+              <w:top w:type="dxa" w:w="30"/>
+              <w:left w:type="dxa" w:w="60"/>
+              <w:bottom w:type="dxa" w:w="30"/>
+              <w:right w:type="dxa" w:w="60"/>
+            </w:tcMar>
+          </w:tcPr>
+          <w:p>
+            <w:pPr>
+              <w:jc w:val="left"/>
+            </w:pPr>
+            <w:r>
+              <w:rPr>
+                <w:rFonts w:ascii="Times New Roman" w:cs="Times New Roman" w:eastAsia="Times New Roman" w:hAnsi="Times New Roman"/>
+                <w:b w:val="false"/>
+                <w:bCs w:val="false"/>
+                <w:sz w:val="16"/>
+                <w:szCs w:val="16"/>
+              </w:rPr>
+              <w:t xml:space="preserve">[8] rule</w:t>
+            </w:r>
+          </w:p>
+        </w:tc>
+        <w:tc>
+          <w:tcPr>
+            <w:tcW w:type="dxa" w:w="2150"/>
+            <w:tcBorders>
+              <w:top w:val="single" w:color="000000" w:sz="4"/>
+              <w:left w:val="single" w:color="000000" w:sz="4"/>
+              <w:bottom w:val="single" w:color="000000" w:sz="4"/>
+              <w:right w:val="single" w:color="000000" w:sz="4"/>
+            </w:tcBorders>
+            <w:shd w:fill="FFFF00" w:color="auto" w:val="clear"/>
+            <w:tcMar>
+              <w:top w:type="dxa" w:w="30"/>
+              <w:left w:type="dxa" w:w="60"/>
+              <w:bottom w:type="dxa" w:w="30"/>
+              <w:right w:type="dxa" w:w="60"/>
+            </w:tcMar>
+          </w:tcPr>
+          <w:p>
+            <w:pPr>
+              <w:jc w:val="left"/>
+            </w:pPr>
+            <w:r>
+              <w:rPr>
+                <w:rFonts w:ascii="Times New Roman" w:cs="Times New Roman" w:eastAsia="Times New Roman" w:hAnsi="Times New Roman"/>
+                <w:b w:val="false"/>
+                <w:bCs w:val="false"/>
+                <w:sz w:val="16"/>
+                <w:szCs w:val="16"/>
+              </w:rPr>
+              <w:t xml:space="preserve">PV–storage microgrid, 60 kW</w:t>
+            </w:r>
+          </w:p>
+        </w:tc>
+        <w:tc>
+          <w:tcPr>
+            <w:tcW w:type="dxa" w:w="1300"/>
+            <w:tcBorders>
+              <w:top w:val="single" w:color="000000" w:sz="4"/>
+              <w:left w:val="single" w:color="000000" w:sz="4"/>
+              <w:bottom w:val="single" w:color="000000" w:sz="4"/>
+              <w:right w:val="single" w:color="000000" w:sz="4"/>
+            </w:tcBorders>
+            <w:shd w:fill="FFFF00" w:color="auto" w:val="clear"/>
+            <w:tcMar>
+              <w:top w:type="dxa" w:w="30"/>
+              <w:left w:type="dxa" w:w="60"/>
+              <w:bottom w:type="dxa" w:w="30"/>
+              <w:right w:type="dxa" w:w="60"/>
+            </w:tcMar>
+          </w:tcPr>
+          <w:p>
+            <w:pPr>
+              <w:jc w:val="left"/>
+            </w:pPr>
+            <w:r>
+              <w:rPr>
+                <w:rFonts w:ascii="Times New Roman" w:cs="Times New Roman" w:eastAsia="Times New Roman" w:hAnsi="Times New Roman"/>
+                <w:b w:val="false"/>
+                <w:bCs w:val="false"/>
+                <w:sz w:val="16"/>
+                <w:szCs w:val="16"/>
+              </w:rPr>
+              <w:t xml:space="preserve">PLECS + HIL</w:t>
+            </w:r>
+          </w:p>
+        </w:tc>
+        <w:tc>
+          <w:tcPr>
+            <w:tcW w:type="dxa" w:w="1500"/>
+            <w:tcBorders>
+              <w:top w:val="single" w:color="000000" w:sz="4"/>
+              <w:left w:val="single" w:color="000000" w:sz="4"/>
+              <w:bottom w:val="single" w:color="000000" w:sz="4"/>
+              <w:right w:val="single" w:color="000000" w:sz="4"/>
+            </w:tcBorders>
+            <w:shd w:fill="FFFF00" w:color="auto" w:val="clear"/>
+            <w:tcMar>
+              <w:top w:type="dxa" w:w="30"/>
+              <w:left w:type="dxa" w:w="60"/>
+              <w:bottom w:type="dxa" w:w="30"/>
+              <w:right w:type="dxa" w:w="60"/>
+            </w:tcMar>
+          </w:tcPr>
+          <w:p>
+            <w:pPr>
+              <w:jc w:val="left"/>
+            </w:pPr>
+            <w:r>
+              <w:rPr>
+                <w:rFonts w:ascii="Times New Roman" w:cs="Times New Roman" w:eastAsia="Times New Roman" w:hAnsi="Times New Roman"/>
+                <w:b w:val="false"/>
+                <w:bCs w:val="false"/>
+                <w:sz w:val="16"/>
+                <w:szCs w:val="16"/>
+              </w:rPr>
+              <w:t xml:space="preserve">Constant inertia</w:t>
+            </w:r>
+          </w:p>
+        </w:tc>
+        <w:tc>
+          <w:tcPr>
+            <w:tcW w:type="dxa" w:w="2100"/>
+            <w:tcBorders>
+              <w:top w:val="single" w:color="000000" w:sz="4"/>
+              <w:left w:val="single" w:color="000000" w:sz="4"/>
+              <w:bottom w:val="single" w:color="000000" w:sz="4"/>
+              <w:right w:val="single" w:color="000000" w:sz="4"/>
+            </w:tcBorders>
+            <w:shd w:fill="FFFF00" w:color="auto" w:val="clear"/>
+            <w:tcMar>
+              <w:top w:type="dxa" w:w="30"/>
+              <w:left w:type="dxa" w:w="60"/>
+              <w:bottom w:type="dxa" w:w="30"/>
+              <w:right w:type="dxa" w:w="60"/>
+            </w:tcMar>
+          </w:tcPr>
+          <w:p>
+            <w:pPr>
+              <w:jc w:val="left"/>
+            </w:pPr>
+            <w:r>
+              <w:rPr>
+                <w:rFonts w:ascii="Times New Roman" w:cs="Times New Roman" w:eastAsia="Times New Roman" w:hAnsi="Times New Roman"/>
+                <w:b w:val="false"/>
+                <w:bCs w:val="false"/>
+                <w:sz w:val="16"/>
+                <w:szCs w:val="16"/>
+              </w:rPr>
+              <w:t xml:space="preserve">Frequency dip −13 to −55 % (Table 3)</w:t>
+            </w:r>
+          </w:p>
+        </w:tc>
+        <w:tc>
+          <w:tcPr>
+            <w:tcW w:type="dxa" w:w="1589"/>
+            <w:tcBorders>
+              <w:top w:val="single" w:color="000000" w:sz="4"/>
+              <w:left w:val="single" w:color="000000" w:sz="4"/>
+              <w:bottom w:val="single" w:color="000000" w:sz="4"/>
+              <w:right w:val="single" w:color="000000" w:sz="4"/>
+            </w:tcBorders>
+            <w:shd w:fill="FFFF00" w:color="auto" w:val="clear"/>
+            <w:tcMar>
+              <w:top w:type="dxa" w:w="30"/>
+              <w:left w:type="dxa" w:w="60"/>
+              <w:bottom w:type="dxa" w:w="30"/>
+              <w:right w:type="dxa" w:w="60"/>
+            </w:tcMar>
+          </w:tcPr>
+          <w:p>
+            <w:pPr>
+              <w:jc w:val="left"/>
+            </w:pPr>
+            <w:r>
+              <w:rPr>
+                <w:rFonts w:ascii="Times New Roman" w:cs="Times New Roman" w:eastAsia="Times New Roman" w:hAnsi="Times New Roman"/>
+                <w:b w:val="false"/>
+                <w:bCs w:val="false"/>
+                <w:sz w:val="16"/>
+                <w:szCs w:val="16"/>
+              </w:rPr>
+              <w:t xml:space="preserve">SoC bands</w:t>
+            </w:r>
+          </w:p>
+        </w:tc>
+      </w:tr>
+      <w:tr>
+        <w:trPr>
+          <w:cantSplit/>
+          <w:tblHeader w:val="false"/>
+        </w:trPr>
+        <w:tc>
+          <w:tcPr>
+            <w:tcW w:type="dxa" w:w="1000"/>
+            <w:tcBorders>
+              <w:top w:val="single" w:color="000000" w:sz="4"/>
+              <w:left w:val="single" w:color="000000" w:sz="4"/>
+              <w:bottom w:val="single" w:color="000000" w:sz="4"/>
+              <w:right w:val="single" w:color="000000" w:sz="4"/>
+            </w:tcBorders>
+            <w:shd w:fill="FFFF00" w:color="auto" w:val="clear"/>
+            <w:tcMar>
+              <w:top w:type="dxa" w:w="30"/>
+              <w:left w:type="dxa" w:w="60"/>
+              <w:bottom w:type="dxa" w:w="30"/>
+              <w:right w:type="dxa" w:w="60"/>
+            </w:tcMar>
+          </w:tcPr>
+          <w:p>
+            <w:pPr>
+              <w:jc w:val="left"/>
+            </w:pPr>
+            <w:r>
+              <w:rPr>
+                <w:rFonts w:ascii="Times New Roman" w:cs="Times New Roman" w:eastAsia="Times New Roman" w:hAnsi="Times New Roman"/>
+                <w:b w:val="false"/>
+                <w:bCs w:val="false"/>
+                <w:sz w:val="16"/>
+                <w:szCs w:val="16"/>
+              </w:rPr>
+              <w:t xml:space="preserve">[10] SAC</w:t>
+            </w:r>
+          </w:p>
+        </w:tc>
+        <w:tc>
+          <w:tcPr>
+            <w:tcW w:type="dxa" w:w="2150"/>
+            <w:tcBorders>
+              <w:top w:val="single" w:color="000000" w:sz="4"/>
+              <w:left w:val="single" w:color="000000" w:sz="4"/>
+              <w:bottom w:val="single" w:color="000000" w:sz="4"/>
+              <w:right w:val="single" w:color="000000" w:sz="4"/>
+            </w:tcBorders>
+            <w:shd w:fill="FFFF00" w:color="auto" w:val="clear"/>
+            <w:tcMar>
+              <w:top w:type="dxa" w:w="30"/>
+              <w:left w:type="dxa" w:w="60"/>
+              <w:bottom w:type="dxa" w:w="30"/>
+              <w:right w:type="dxa" w:w="60"/>
+            </w:tcMar>
+          </w:tcPr>
+          <w:p>
+            <w:pPr>
+              <w:jc w:val="left"/>
+            </w:pPr>
+            <w:r>
+              <w:rPr>
+                <w:rFonts w:ascii="Times New Roman" w:cs="Times New Roman" w:eastAsia="Times New Roman" w:hAnsi="Times New Roman"/>
+                <w:b w:val="false"/>
+                <w:bCs w:val="false"/>
+                <w:sz w:val="16"/>
+                <w:szCs w:val="16"/>
+              </w:rPr>
+              <w:t xml:space="preserve">100 kW VSG, 0 → 20 kW step</w:t>
+            </w:r>
+          </w:p>
+        </w:tc>
+        <w:tc>
+          <w:tcPr>
+            <w:tcW w:type="dxa" w:w="1300"/>
+            <w:tcBorders>
+              <w:top w:val="single" w:color="000000" w:sz="4"/>
+              <w:left w:val="single" w:color="000000" w:sz="4"/>
+              <w:bottom w:val="single" w:color="000000" w:sz="4"/>
+              <w:right w:val="single" w:color="000000" w:sz="4"/>
+            </w:tcBorders>
+            <w:shd w:fill="FFFF00" w:color="auto" w:val="clear"/>
+            <w:tcMar>
+              <w:top w:type="dxa" w:w="30"/>
+              <w:left w:type="dxa" w:w="60"/>
+              <w:bottom w:type="dxa" w:w="30"/>
+              <w:right w:type="dxa" w:w="60"/>
+            </w:tcMar>
+          </w:tcPr>
+          <w:p>
+            <w:pPr>
+              <w:jc w:val="left"/>
+            </w:pPr>
+            <w:r>
+              <w:rPr>
+                <w:rFonts w:ascii="Times New Roman" w:cs="Times New Roman" w:eastAsia="Times New Roman" w:hAnsi="Times New Roman"/>
+                <w:b w:val="false"/>
+                <w:bCs w:val="false"/>
+                <w:sz w:val="16"/>
+                <w:szCs w:val="16"/>
+              </w:rPr>
+              <w:t xml:space="preserve">Simulink</w:t>
+            </w:r>
+          </w:p>
+        </w:tc>
+        <w:tc>
+          <w:tcPr>
+            <w:tcW w:type="dxa" w:w="1500"/>
+            <w:tcBorders>
+              <w:top w:val="single" w:color="000000" w:sz="4"/>
+              <w:left w:val="single" w:color="000000" w:sz="4"/>
+              <w:bottom w:val="single" w:color="000000" w:sz="4"/>
+              <w:right w:val="single" w:color="000000" w:sz="4"/>
+            </w:tcBorders>
+            <w:shd w:fill="FFFF00" w:color="auto" w:val="clear"/>
+            <w:tcMar>
+              <w:top w:type="dxa" w:w="30"/>
+              <w:left w:type="dxa" w:w="60"/>
+              <w:bottom w:type="dxa" w:w="30"/>
+              <w:right w:type="dxa" w:w="60"/>
+            </w:tcMar>
+          </w:tcPr>
+          <w:p>
+            <w:pPr>
+              <w:jc w:val="left"/>
+            </w:pPr>
+            <w:r>
+              <w:rPr>
+                <w:rFonts w:ascii="Times New Roman" w:cs="Times New Roman" w:eastAsia="Times New Roman" w:hAnsi="Times New Roman"/>
+                <w:b w:val="false"/>
+                <w:bCs w:val="false"/>
+                <w:sz w:val="16"/>
+                <w:szCs w:val="16"/>
+              </w:rPr>
+              <w:t xml:space="preserve">Fixed VSG</w:t>
+            </w:r>
+          </w:p>
+        </w:tc>
+        <w:tc>
+          <w:tcPr>
+            <w:tcW w:type="dxa" w:w="2100"/>
+            <w:tcBorders>
+              <w:top w:val="single" w:color="000000" w:sz="4"/>
+              <w:left w:val="single" w:color="000000" w:sz="4"/>
+              <w:bottom w:val="single" w:color="000000" w:sz="4"/>
+              <w:right w:val="single" w:color="000000" w:sz="4"/>
+            </w:tcBorders>
+            <w:shd w:fill="FFFF00" w:color="auto" w:val="clear"/>
+            <w:tcMar>
+              <w:top w:type="dxa" w:w="30"/>
+              <w:left w:type="dxa" w:w="60"/>
+              <w:bottom w:type="dxa" w:w="30"/>
+              <w:right w:type="dxa" w:w="60"/>
+            </w:tcMar>
+          </w:tcPr>
+          <w:p>
+            <w:pPr>
+              <w:jc w:val="left"/>
+            </w:pPr>
+            <w:r>
+              <w:rPr>
+                <w:rFonts w:ascii="Times New Roman" w:cs="Times New Roman" w:eastAsia="Times New Roman" w:hAnsi="Times New Roman"/>
+                <w:b w:val="false"/>
+                <w:bCs w:val="false"/>
+                <w:sz w:val="16"/>
+                <w:szCs w:val="16"/>
+              </w:rPr>
+              <w:t xml:space="preserve">Δf 0.35 → 0.21 Hz (Table 2)</w:t>
+            </w:r>
+          </w:p>
+        </w:tc>
+        <w:tc>
+          <w:tcPr>
+            <w:tcW w:type="dxa" w:w="1589"/>
+            <w:tcBorders>
+              <w:top w:val="single" w:color="000000" w:sz="4"/>
+              <w:left w:val="single" w:color="000000" w:sz="4"/>
+              <w:bottom w:val="single" w:color="000000" w:sz="4"/>
+              <w:right w:val="single" w:color="000000" w:sz="4"/>
+            </w:tcBorders>
+            <w:shd w:fill="FFFF00" w:color="auto" w:val="clear"/>
+            <w:tcMar>
+              <w:top w:type="dxa" w:w="30"/>
+              <w:left w:type="dxa" w:w="60"/>
+              <w:bottom w:type="dxa" w:w="30"/>
+              <w:right w:type="dxa" w:w="60"/>
+            </w:tcMar>
+          </w:tcPr>
+          <w:p>
+            <w:pPr>
+              <w:jc w:val="left"/>
+            </w:pPr>
+            <w:r>
+              <w:rPr>
+                <w:rFonts w:ascii="Times New Roman" w:cs="Times New Roman" w:eastAsia="Times New Roman" w:hAnsi="Times New Roman"/>
+                <w:b w:val="false"/>
+                <w:bCs w:val="false"/>
+                <w:sz w:val="16"/>
+                <w:szCs w:val="16"/>
+              </w:rPr>
+              <w:t xml:space="preserve">Fixed J–D region</w:t>
+            </w:r>
+          </w:p>
+        </w:tc>
+      </w:tr>
+      <w:tr>
+        <w:trPr>
+          <w:cantSplit/>
+          <w:tblHeader w:val="false"/>
+        </w:trPr>
+        <w:tc>
+          <w:tcPr>
+            <w:tcW w:type="dxa" w:w="1000"/>
+            <w:tcBorders>
+              <w:top w:val="single" w:color="000000" w:sz="4"/>
+              <w:left w:val="single" w:color="000000" w:sz="4"/>
+              <w:bottom w:val="single" w:color="000000" w:sz="4"/>
+              <w:right w:val="single" w:color="000000" w:sz="4"/>
+            </w:tcBorders>
+            <w:shd w:fill="FFFF00" w:color="auto" w:val="clear"/>
+            <w:tcMar>
+              <w:top w:type="dxa" w:w="30"/>
+              <w:left w:type="dxa" w:w="60"/>
+              <w:bottom w:type="dxa" w:w="30"/>
+              <w:right w:type="dxa" w:w="60"/>
+            </w:tcMar>
+          </w:tcPr>
+          <w:p>
+            <w:pPr>
+              <w:jc w:val="left"/>
+            </w:pPr>
+            <w:r>
+              <w:rPr>
+                <w:rFonts w:ascii="Times New Roman" w:cs="Times New Roman" w:eastAsia="Times New Roman" w:hAnsi="Times New Roman"/>
+                <w:b w:val="false"/>
+                <w:bCs w:val="false"/>
+                <w:sz w:val="16"/>
+                <w:szCs w:val="16"/>
+              </w:rPr>
+              <w:t xml:space="preserve">[11] TD3</w:t>
+            </w:r>
+          </w:p>
+        </w:tc>
+        <w:tc>
+          <w:tcPr>
+            <w:tcW w:type="dxa" w:w="2150"/>
+            <w:tcBorders>
+              <w:top w:val="single" w:color="000000" w:sz="4"/>
+              <w:left w:val="single" w:color="000000" w:sz="4"/>
+              <w:bottom w:val="single" w:color="000000" w:sz="4"/>
+              <w:right w:val="single" w:color="000000" w:sz="4"/>
+            </w:tcBorders>
+            <w:shd w:fill="FFFF00" w:color="auto" w:val="clear"/>
+            <w:tcMar>
+              <w:top w:type="dxa" w:w="30"/>
+              <w:left w:type="dxa" w:w="60"/>
+              <w:bottom w:type="dxa" w:w="30"/>
+              <w:right w:type="dxa" w:w="60"/>
+            </w:tcMar>
+          </w:tcPr>
+          <w:p>
+            <w:pPr>
+              <w:jc w:val="left"/>
+            </w:pPr>
+            <w:r>
+              <w:rPr>
+                <w:rFonts w:ascii="Times New Roman" w:cs="Times New Roman" w:eastAsia="Times New Roman" w:hAnsi="Times New Roman"/>
+                <w:b w:val="false"/>
+                <w:bCs w:val="false"/>
+                <w:sz w:val="16"/>
+                <w:szCs w:val="16"/>
+              </w:rPr>
+              <w:t xml:space="preserve">IEEE 34-node feeder, 3 DGs</w:t>
+            </w:r>
+          </w:p>
+        </w:tc>
+        <w:tc>
+          <w:tcPr>
+            <w:tcW w:type="dxa" w:w="1300"/>
+            <w:tcBorders>
+              <w:top w:val="single" w:color="000000" w:sz="4"/>
+              <w:left w:val="single" w:color="000000" w:sz="4"/>
+              <w:bottom w:val="single" w:color="000000" w:sz="4"/>
+              <w:right w:val="single" w:color="000000" w:sz="4"/>
+            </w:tcBorders>
+            <w:shd w:fill="FFFF00" w:color="auto" w:val="clear"/>
+            <w:tcMar>
+              <w:top w:type="dxa" w:w="30"/>
+              <w:left w:type="dxa" w:w="60"/>
+              <w:bottom w:type="dxa" w:w="30"/>
+              <w:right w:type="dxa" w:w="60"/>
+            </w:tcMar>
+          </w:tcPr>
+          <w:p>
+            <w:pPr>
+              <w:jc w:val="left"/>
+            </w:pPr>
+            <w:r>
+              <w:rPr>
+                <w:rFonts w:ascii="Times New Roman" w:cs="Times New Roman" w:eastAsia="Times New Roman" w:hAnsi="Times New Roman"/>
+                <w:b w:val="false"/>
+                <w:bCs w:val="false"/>
+                <w:sz w:val="16"/>
+                <w:szCs w:val="16"/>
+              </w:rPr>
+              <w:t xml:space="preserve">Simulink</w:t>
+            </w:r>
+          </w:p>
+        </w:tc>
+        <w:tc>
+          <w:tcPr>
+            <w:tcW w:type="dxa" w:w="1500"/>
+            <w:tcBorders>
+              <w:top w:val="single" w:color="000000" w:sz="4"/>
+              <w:left w:val="single" w:color="000000" w:sz="4"/>
+              <w:bottom w:val="single" w:color="000000" w:sz="4"/>
+              <w:right w:val="single" w:color="000000" w:sz="4"/>
+            </w:tcBorders>
+            <w:shd w:fill="FFFF00" w:color="auto" w:val="clear"/>
+            <w:tcMar>
+              <w:top w:type="dxa" w:w="30"/>
+              <w:left w:type="dxa" w:w="60"/>
+              <w:bottom w:type="dxa" w:w="30"/>
+              <w:right w:type="dxa" w:w="60"/>
+            </w:tcMar>
+          </w:tcPr>
+          <w:p>
+            <w:pPr>
+              <w:jc w:val="left"/>
+            </w:pPr>
+            <w:r>
+              <w:rPr>
+                <w:rFonts w:ascii="Times New Roman" w:cs="Times New Roman" w:eastAsia="Times New Roman" w:hAnsi="Times New Roman"/>
+                <w:b w:val="false"/>
+                <w:bCs w:val="false"/>
+                <w:sz w:val="16"/>
+                <w:szCs w:val="16"/>
+              </w:rPr>
+              <w:t xml:space="preserve">PI</w:t>
+            </w:r>
+          </w:p>
+        </w:tc>
+        <w:tc>
+          <w:tcPr>
+            <w:tcW w:type="dxa" w:w="2100"/>
+            <w:tcBorders>
+              <w:top w:val="single" w:color="000000" w:sz="4"/>
+              <w:left w:val="single" w:color="000000" w:sz="4"/>
+              <w:bottom w:val="single" w:color="000000" w:sz="4"/>
+              <w:right w:val="single" w:color="000000" w:sz="4"/>
+            </w:tcBorders>
+            <w:shd w:fill="FFFF00" w:color="auto" w:val="clear"/>
+            <w:tcMar>
+              <w:top w:type="dxa" w:w="30"/>
+              <w:left w:type="dxa" w:w="60"/>
+              <w:bottom w:type="dxa" w:w="30"/>
+              <w:right w:type="dxa" w:w="60"/>
+            </w:tcMar>
+          </w:tcPr>
+          <w:p>
+            <w:pPr>
+              <w:jc w:val="left"/>
+            </w:pPr>
+            <w:r>
+              <w:rPr>
+                <w:rFonts w:ascii="Times New Roman" w:cs="Times New Roman" w:eastAsia="Times New Roman" w:hAnsi="Times New Roman"/>
+                <w:b w:val="false"/>
+                <w:bCs w:val="false"/>
+                <w:sz w:val="16"/>
+                <w:szCs w:val="16"/>
+              </w:rPr>
+              <w:t xml:space="preserve">Mean abs. Δf error −56.6 %</w:t>
+            </w:r>
+          </w:p>
+        </w:tc>
+        <w:tc>
+          <w:tcPr>
+            <w:tcW w:type="dxa" w:w="1589"/>
+            <w:tcBorders>
+              <w:top w:val="single" w:color="000000" w:sz="4"/>
+              <w:left w:val="single" w:color="000000" w:sz="4"/>
+              <w:bottom w:val="single" w:color="000000" w:sz="4"/>
+              <w:right w:val="single" w:color="000000" w:sz="4"/>
+            </w:tcBorders>
+            <w:shd w:fill="FFFF00" w:color="auto" w:val="clear"/>
+            <w:tcMar>
+              <w:top w:type="dxa" w:w="30"/>
+              <w:left w:type="dxa" w:w="60"/>
+              <w:bottom w:type="dxa" w:w="30"/>
+              <w:right w:type="dxa" w:w="60"/>
+            </w:tcMar>
+          </w:tcPr>
+          <w:p>
+            <w:pPr>
+              <w:jc w:val="left"/>
+            </w:pPr>
+            <w:r>
+              <w:rPr>
+                <w:rFonts w:ascii="Times New Roman" w:cs="Times New Roman" w:eastAsia="Times New Roman" w:hAnsi="Times New Roman"/>
+                <w:b w:val="false"/>
+                <w:bCs w:val="false"/>
+                <w:sz w:val="16"/>
+                <w:szCs w:val="16"/>
+              </w:rPr>
+              <w:t xml:space="preserve">–</w:t>
+            </w:r>
+          </w:p>
+        </w:tc>
+      </w:tr>
+      <w:tr>
+        <w:trPr>
+          <w:cantSplit/>
+          <w:tblHeader w:val="false"/>
+        </w:trPr>
+        <w:tc>
+          <w:tcPr>
+            <w:tcW w:type="dxa" w:w="1000"/>
+            <w:tcBorders>
+              <w:top w:val="single" w:color="000000" w:sz="4"/>
+              <w:left w:val="single" w:color="000000" w:sz="4"/>
+              <w:bottom w:val="single" w:color="000000" w:sz="4"/>
+              <w:right w:val="single" w:color="000000" w:sz="4"/>
+            </w:tcBorders>
+            <w:shd w:fill="FFFF00" w:color="auto" w:val="clear"/>
+            <w:tcMar>
+              <w:top w:type="dxa" w:w="30"/>
+              <w:left w:type="dxa" w:w="60"/>
+              <w:bottom w:type="dxa" w:w="30"/>
+              <w:right w:type="dxa" w:w="60"/>
+            </w:tcMar>
+          </w:tcPr>
+          <w:p>
+            <w:pPr>
+              <w:jc w:val="left"/>
+            </w:pPr>
+            <w:r>
+              <w:rPr>
+                <w:rFonts w:ascii="Times New Roman" w:cs="Times New Roman" w:eastAsia="Times New Roman" w:hAnsi="Times New Roman"/>
+                <w:b w:val="false"/>
+                <w:bCs w:val="false"/>
+                <w:sz w:val="16"/>
+                <w:szCs w:val="16"/>
+              </w:rPr>
+              <w:t xml:space="preserve">[12] TD3</w:t>
+            </w:r>
+          </w:p>
+        </w:tc>
+        <w:tc>
+          <w:tcPr>
+            <w:tcW w:type="dxa" w:w="2150"/>
+            <w:tcBorders>
+              <w:top w:val="single" w:color="000000" w:sz="4"/>
+              <w:left w:val="single" w:color="000000" w:sz="4"/>
+              <w:bottom w:val="single" w:color="000000" w:sz="4"/>
+              <w:right w:val="single" w:color="000000" w:sz="4"/>
+            </w:tcBorders>
+            <w:shd w:fill="FFFF00" w:color="auto" w:val="clear"/>
+            <w:tcMar>
+              <w:top w:type="dxa" w:w="30"/>
+              <w:left w:type="dxa" w:w="60"/>
+              <w:bottom w:type="dxa" w:w="30"/>
+              <w:right w:type="dxa" w:w="60"/>
+            </w:tcMar>
+          </w:tcPr>
+          <w:p>
+            <w:pPr>
+              <w:jc w:val="left"/>
+            </w:pPr>
+            <w:r>
+              <w:rPr>
+                <w:rFonts w:ascii="Times New Roman" w:cs="Times New Roman" w:eastAsia="Times New Roman" w:hAnsi="Times New Roman"/>
+                <w:b w:val="false"/>
+                <w:bCs w:val="false"/>
+                <w:sz w:val="16"/>
+                <w:szCs w:val="16"/>
+              </w:rPr>
+              <w:t xml:space="preserve">Banshee feeder (PV, BESS), MW</w:t>
+            </w:r>
+          </w:p>
+        </w:tc>
+        <w:tc>
+          <w:tcPr>
+            <w:tcW w:type="dxa" w:w="1300"/>
+            <w:tcBorders>
+              <w:top w:val="single" w:color="000000" w:sz="4"/>
+              <w:left w:val="single" w:color="000000" w:sz="4"/>
+              <w:bottom w:val="single" w:color="000000" w:sz="4"/>
+              <w:right w:val="single" w:color="000000" w:sz="4"/>
+            </w:tcBorders>
+            <w:shd w:fill="FFFF00" w:color="auto" w:val="clear"/>
+            <w:tcMar>
+              <w:top w:type="dxa" w:w="30"/>
+              <w:left w:type="dxa" w:w="60"/>
+              <w:bottom w:type="dxa" w:w="30"/>
+              <w:right w:type="dxa" w:w="60"/>
+            </w:tcMar>
+          </w:tcPr>
+          <w:p>
+            <w:pPr>
+              <w:jc w:val="left"/>
+            </w:pPr>
+            <w:r>
+              <w:rPr>
+                <w:rFonts w:ascii="Times New Roman" w:cs="Times New Roman" w:eastAsia="Times New Roman" w:hAnsi="Times New Roman"/>
+                <w:b w:val="false"/>
+                <w:bCs w:val="false"/>
+                <w:sz w:val="16"/>
+                <w:szCs w:val="16"/>
+              </w:rPr>
+              <w:t xml:space="preserve">Simulink + RTDS</w:t>
+            </w:r>
+          </w:p>
+        </w:tc>
+        <w:tc>
+          <w:tcPr>
+            <w:tcW w:type="dxa" w:w="1500"/>
+            <w:tcBorders>
+              <w:top w:val="single" w:color="000000" w:sz="4"/>
+              <w:left w:val="single" w:color="000000" w:sz="4"/>
+              <w:bottom w:val="single" w:color="000000" w:sz="4"/>
+              <w:right w:val="single" w:color="000000" w:sz="4"/>
+            </w:tcBorders>
+            <w:shd w:fill="FFFF00" w:color="auto" w:val="clear"/>
+            <w:tcMar>
+              <w:top w:type="dxa" w:w="30"/>
+              <w:left w:type="dxa" w:w="60"/>
+              <w:bottom w:type="dxa" w:w="30"/>
+              <w:right w:type="dxa" w:w="60"/>
+            </w:tcMar>
+          </w:tcPr>
+          <w:p>
+            <w:pPr>
+              <w:jc w:val="left"/>
+            </w:pPr>
+            <w:r>
+              <w:rPr>
+                <w:rFonts w:ascii="Times New Roman" w:cs="Times New Roman" w:eastAsia="Times New Roman" w:hAnsi="Times New Roman"/>
+                <w:b w:val="false"/>
+                <w:bCs w:val="false"/>
+                <w:sz w:val="16"/>
+                <w:szCs w:val="16"/>
+              </w:rPr>
+              <w:t xml:space="preserve">Fixed, fuzzy, DDPG</w:t>
+            </w:r>
+          </w:p>
+        </w:tc>
+        <w:tc>
+          <w:tcPr>
+            <w:tcW w:type="dxa" w:w="2100"/>
+            <w:tcBorders>
+              <w:top w:val="single" w:color="000000" w:sz="4"/>
+              <w:left w:val="single" w:color="000000" w:sz="4"/>
+              <w:bottom w:val="single" w:color="000000" w:sz="4"/>
+              <w:right w:val="single" w:color="000000" w:sz="4"/>
+            </w:tcBorders>
+            <w:shd w:fill="FFFF00" w:color="auto" w:val="clear"/>
+            <w:tcMar>
+              <w:top w:type="dxa" w:w="30"/>
+              <w:left w:type="dxa" w:w="60"/>
+              <w:bottom w:type="dxa" w:w="30"/>
+              <w:right w:type="dxa" w:w="60"/>
+            </w:tcMar>
+          </w:tcPr>
+          <w:p>
+            <w:pPr>
+              <w:jc w:val="left"/>
+            </w:pPr>
+            <w:r>
+              <w:rPr>
+                <w:rFonts w:ascii="Times New Roman" w:cs="Times New Roman" w:eastAsia="Times New Roman" w:hAnsi="Times New Roman"/>
+                <w:b w:val="false"/>
+                <w:bCs w:val="false"/>
+                <w:sz w:val="16"/>
+                <w:szCs w:val="16"/>
+              </w:rPr>
+              <w:t xml:space="preserve">Graphical only</w:t>
+            </w:r>
+          </w:p>
+        </w:tc>
+        <w:tc>
+          <w:tcPr>
+            <w:tcW w:type="dxa" w:w="1589"/>
+            <w:tcBorders>
+              <w:top w:val="single" w:color="000000" w:sz="4"/>
+              <w:left w:val="single" w:color="000000" w:sz="4"/>
+              <w:bottom w:val="single" w:color="000000" w:sz="4"/>
+              <w:right w:val="single" w:color="000000" w:sz="4"/>
+            </w:tcBorders>
+            <w:shd w:fill="FFFF00" w:color="auto" w:val="clear"/>
+            <w:tcMar>
+              <w:top w:type="dxa" w:w="30"/>
+              <w:left w:type="dxa" w:w="60"/>
+              <w:bottom w:type="dxa" w:w="30"/>
+              <w:right w:type="dxa" w:w="60"/>
+            </w:tcMar>
+          </w:tcPr>
+          <w:p>
+            <w:pPr>
+              <w:jc w:val="left"/>
+            </w:pPr>
+            <w:r>
+              <w:rPr>
+                <w:rFonts w:ascii="Times New Roman" w:cs="Times New Roman" w:eastAsia="Times New Roman" w:hAnsi="Times New Roman"/>
+                <w:b w:val="false"/>
+                <w:bCs w:val="false"/>
+                <w:sz w:val="16"/>
+                <w:szCs w:val="16"/>
+              </w:rPr>
+              <w:t xml:space="preserve">–</w:t>
+            </w:r>
+          </w:p>
+        </w:tc>
+      </w:tr>
+      <w:tr>
+        <w:trPr>
+          <w:cantSplit/>
+          <w:tblHeader w:val="false"/>
+        </w:trPr>
+        <w:tc>
+          <w:tcPr>
+            <w:tcW w:type="dxa" w:w="1000"/>
+            <w:tcBorders>
+              <w:top w:val="single" w:color="000000" w:sz="4"/>
+              <w:left w:val="single" w:color="000000" w:sz="4"/>
+              <w:bottom w:val="single" w:color="000000" w:sz="4"/>
+              <w:right w:val="single" w:color="000000" w:sz="4"/>
+            </w:tcBorders>
+            <w:shd w:fill="FFFF00" w:color="auto" w:val="clear"/>
+            <w:tcMar>
+              <w:top w:type="dxa" w:w="30"/>
+              <w:left w:type="dxa" w:w="60"/>
+              <w:bottom w:type="dxa" w:w="30"/>
+              <w:right w:type="dxa" w:w="60"/>
+            </w:tcMar>
+          </w:tcPr>
+          <w:p>
+            <w:pPr>
+              <w:jc w:val="left"/>
+            </w:pPr>
+            <w:r>
+              <w:rPr>
+                <w:rFonts w:ascii="Times New Roman" w:cs="Times New Roman" w:eastAsia="Times New Roman" w:hAnsi="Times New Roman"/>
+                <w:b w:val="false"/>
+                <w:bCs w:val="false"/>
+                <w:sz w:val="16"/>
+                <w:szCs w:val="16"/>
+              </w:rPr>
+              <w:t xml:space="preserve">[32] PINN+TD3</w:t>
+            </w:r>
+          </w:p>
+        </w:tc>
+        <w:tc>
+          <w:tcPr>
+            <w:tcW w:type="dxa" w:w="2150"/>
+            <w:tcBorders>
+              <w:top w:val="single" w:color="000000" w:sz="4"/>
+              <w:left w:val="single" w:color="000000" w:sz="4"/>
+              <w:bottom w:val="single" w:color="000000" w:sz="4"/>
+              <w:right w:val="single" w:color="000000" w:sz="4"/>
+            </w:tcBorders>
+            <w:shd w:fill="FFFF00" w:color="auto" w:val="clear"/>
+            <w:tcMar>
+              <w:top w:type="dxa" w:w="30"/>
+              <w:left w:type="dxa" w:w="60"/>
+              <w:bottom w:type="dxa" w:w="30"/>
+              <w:right w:type="dxa" w:w="60"/>
+            </w:tcMar>
+          </w:tcPr>
+          <w:p>
+            <w:pPr>
+              <w:jc w:val="left"/>
+            </w:pPr>
+            <w:r>
+              <w:rPr>
+                <w:rFonts w:ascii="Times New Roman" w:cs="Times New Roman" w:eastAsia="Times New Roman" w:hAnsi="Times New Roman"/>
+                <w:b w:val="false"/>
+                <w:bCs w:val="false"/>
+                <w:sz w:val="16"/>
+                <w:szCs w:val="16"/>
+              </w:rPr>
+              <w:t xml:space="preserve">IEEE 34/39-bus, 4 × 2 MW DGs</w:t>
+            </w:r>
+          </w:p>
+        </w:tc>
+        <w:tc>
+          <w:tcPr>
+            <w:tcW w:type="dxa" w:w="1300"/>
+            <w:tcBorders>
+              <w:top w:val="single" w:color="000000" w:sz="4"/>
+              <w:left w:val="single" w:color="000000" w:sz="4"/>
+              <w:bottom w:val="single" w:color="000000" w:sz="4"/>
+              <w:right w:val="single" w:color="000000" w:sz="4"/>
+            </w:tcBorders>
+            <w:shd w:fill="FFFF00" w:color="auto" w:val="clear"/>
+            <w:tcMar>
+              <w:top w:type="dxa" w:w="30"/>
+              <w:left w:type="dxa" w:w="60"/>
+              <w:bottom w:type="dxa" w:w="30"/>
+              <w:right w:type="dxa" w:w="60"/>
+            </w:tcMar>
+          </w:tcPr>
+          <w:p>
+            <w:pPr>
+              <w:jc w:val="left"/>
+            </w:pPr>
+            <w:r>
+              <w:rPr>
+                <w:rFonts w:ascii="Times New Roman" w:cs="Times New Roman" w:eastAsia="Times New Roman" w:hAnsi="Times New Roman"/>
+                <w:b w:val="false"/>
+                <w:bCs w:val="false"/>
+                <w:sz w:val="16"/>
+                <w:szCs w:val="16"/>
+              </w:rPr>
+              <w:t xml:space="preserve">Simulink</w:t>
+            </w:r>
+          </w:p>
+        </w:tc>
+        <w:tc>
+          <w:tcPr>
+            <w:tcW w:type="dxa" w:w="1500"/>
+            <w:tcBorders>
+              <w:top w:val="single" w:color="000000" w:sz="4"/>
+              <w:left w:val="single" w:color="000000" w:sz="4"/>
+              <w:bottom w:val="single" w:color="000000" w:sz="4"/>
+              <w:right w:val="single" w:color="000000" w:sz="4"/>
+            </w:tcBorders>
+            <w:shd w:fill="FFFF00" w:color="auto" w:val="clear"/>
+            <w:tcMar>
+              <w:top w:type="dxa" w:w="30"/>
+              <w:left w:type="dxa" w:w="60"/>
+              <w:bottom w:type="dxa" w:w="30"/>
+              <w:right w:type="dxa" w:w="60"/>
+            </w:tcMar>
+          </w:tcPr>
+          <w:p>
+            <w:pPr>
+              <w:jc w:val="left"/>
+            </w:pPr>
+            <w:r>
+              <w:rPr>
+                <w:rFonts w:ascii="Times New Roman" w:cs="Times New Roman" w:eastAsia="Times New Roman" w:hAnsi="Times New Roman"/>
+                <w:b w:val="false"/>
+                <w:bCs w:val="false"/>
+                <w:sz w:val="16"/>
+                <w:szCs w:val="16"/>
+              </w:rPr>
+              <w:t xml:space="preserve">PI, MPC</w:t>
+            </w:r>
+          </w:p>
+        </w:tc>
+        <w:tc>
+          <w:tcPr>
+            <w:tcW w:type="dxa" w:w="2100"/>
+            <w:tcBorders>
+              <w:top w:val="single" w:color="000000" w:sz="4"/>
+              <w:left w:val="single" w:color="000000" w:sz="4"/>
+              <w:bottom w:val="single" w:color="000000" w:sz="4"/>
+              <w:right w:val="single" w:color="000000" w:sz="4"/>
+            </w:tcBorders>
+            <w:shd w:fill="FFFF00" w:color="auto" w:val="clear"/>
+            <w:tcMar>
+              <w:top w:type="dxa" w:w="30"/>
+              <w:left w:type="dxa" w:w="60"/>
+              <w:bottom w:type="dxa" w:w="30"/>
+              <w:right w:type="dxa" w:w="60"/>
+            </w:tcMar>
+          </w:tcPr>
+          <w:p>
+            <w:pPr>
+              <w:jc w:val="left"/>
+            </w:pPr>
+            <w:r>
+              <w:rPr>
+                <w:rFonts w:ascii="Times New Roman" w:cs="Times New Roman" w:eastAsia="Times New Roman" w:hAnsi="Times New Roman"/>
+                <w:b w:val="false"/>
+                <w:bCs w:val="false"/>
+                <w:sz w:val="16"/>
+                <w:szCs w:val="16"/>
+              </w:rPr>
+              <w:t xml:space="preserve">max |Δf| 0.062 → 0.006 Hz</w:t>
+            </w:r>
+          </w:p>
+        </w:tc>
+        <w:tc>
+          <w:tcPr>
+            <w:tcW w:type="dxa" w:w="1589"/>
+            <w:tcBorders>
+              <w:top w:val="single" w:color="000000" w:sz="4"/>
+              <w:left w:val="single" w:color="000000" w:sz="4"/>
+              <w:bottom w:val="single" w:color="000000" w:sz="4"/>
+              <w:right w:val="single" w:color="000000" w:sz="4"/>
+            </w:tcBorders>
+            <w:shd w:fill="FFFF00" w:color="auto" w:val="clear"/>
+            <w:tcMar>
+              <w:top w:type="dxa" w:w="30"/>
+              <w:left w:type="dxa" w:w="60"/>
+              <w:bottom w:type="dxa" w:w="30"/>
+              <w:right w:type="dxa" w:w="60"/>
+            </w:tcMar>
+          </w:tcPr>
+          <w:p>
+            <w:pPr>
+              <w:jc w:val="left"/>
+            </w:pPr>
+            <w:r>
+              <w:rPr>
+                <w:rFonts w:ascii="Times New Roman" w:cs="Times New Roman" w:eastAsia="Times New Roman" w:hAnsi="Times New Roman"/>
+                <w:b w:val="false"/>
+                <w:bCs w:val="false"/>
+                <w:sz w:val="16"/>
+                <w:szCs w:val="16"/>
+              </w:rPr>
+              <w:t xml:space="preserve">Fixed power bounds</w:t>
+            </w:r>
+          </w:p>
+        </w:tc>
+      </w:tr>
+      <w:tr>
+        <w:trPr>
+          <w:cantSplit/>
+          <w:tblHeader w:val="false"/>
+        </w:trPr>
+        <w:tc>
+          <w:tcPr>
+            <w:tcW w:type="dxa" w:w="1000"/>
+            <w:tcBorders>
+              <w:top w:val="single" w:color="000000" w:sz="4"/>
+              <w:left w:val="single" w:color="000000" w:sz="4"/>
+              <w:bottom w:val="single" w:color="000000" w:sz="4"/>
+              <w:right w:val="single" w:color="000000" w:sz="4"/>
+            </w:tcBorders>
+            <w:shd w:fill="FFFF00" w:color="auto" w:val="clear"/>
+            <w:tcMar>
+              <w:top w:type="dxa" w:w="30"/>
+              <w:left w:type="dxa" w:w="60"/>
+              <w:bottom w:type="dxa" w:w="30"/>
+              <w:right w:type="dxa" w:w="60"/>
+            </w:tcMar>
+          </w:tcPr>
+          <w:p>
+            <w:pPr>
+              <w:jc w:val="left"/>
+            </w:pPr>
+            <w:r>
+              <w:rPr>
+                <w:rFonts w:ascii="Times New Roman" w:cs="Times New Roman" w:eastAsia="Times New Roman" w:hAnsi="Times New Roman"/>
+                <w:b w:val="false"/>
+                <w:bCs w:val="false"/>
+                <w:sz w:val="16"/>
+                <w:szCs w:val="16"/>
+              </w:rPr>
+              <w:t xml:space="preserve">[14] SAC</w:t>
+            </w:r>
+          </w:p>
+        </w:tc>
+        <w:tc>
+          <w:tcPr>
+            <w:tcW w:type="dxa" w:w="2150"/>
+            <w:tcBorders>
+              <w:top w:val="single" w:color="000000" w:sz="4"/>
+              <w:left w:val="single" w:color="000000" w:sz="4"/>
+              <w:bottom w:val="single" w:color="000000" w:sz="4"/>
+              <w:right w:val="single" w:color="000000" w:sz="4"/>
+            </w:tcBorders>
+            <w:shd w:fill="FFFF00" w:color="auto" w:val="clear"/>
+            <w:tcMar>
+              <w:top w:type="dxa" w:w="30"/>
+              <w:left w:type="dxa" w:w="60"/>
+              <w:bottom w:type="dxa" w:w="30"/>
+              <w:right w:type="dxa" w:w="60"/>
+            </w:tcMar>
+          </w:tcPr>
+          <w:p>
+            <w:pPr>
+              <w:jc w:val="left"/>
+            </w:pPr>
+            <w:r>
+              <w:rPr>
+                <w:rFonts w:ascii="Times New Roman" w:cs="Times New Roman" w:eastAsia="Times New Roman" w:hAnsi="Times New Roman"/>
+                <w:b w:val="false"/>
+                <w:bCs w:val="false"/>
+                <w:sz w:val="16"/>
+                <w:szCs w:val="16"/>
+              </w:rPr>
+              <w:t xml:space="preserve">Two-area model, PV–wind–diesel</w:t>
+            </w:r>
+          </w:p>
+        </w:tc>
+        <w:tc>
+          <w:tcPr>
+            <w:tcW w:type="dxa" w:w="1300"/>
+            <w:tcBorders>
+              <w:top w:val="single" w:color="000000" w:sz="4"/>
+              <w:left w:val="single" w:color="000000" w:sz="4"/>
+              <w:bottom w:val="single" w:color="000000" w:sz="4"/>
+              <w:right w:val="single" w:color="000000" w:sz="4"/>
+            </w:tcBorders>
+            <w:shd w:fill="FFFF00" w:color="auto" w:val="clear"/>
+            <w:tcMar>
+              <w:top w:type="dxa" w:w="30"/>
+              <w:left w:type="dxa" w:w="60"/>
+              <w:bottom w:type="dxa" w:w="30"/>
+              <w:right w:type="dxa" w:w="60"/>
+            </w:tcMar>
+          </w:tcPr>
+          <w:p>
+            <w:pPr>
+              <w:jc w:val="left"/>
+            </w:pPr>
+            <w:r>
+              <w:rPr>
+                <w:rFonts w:ascii="Times New Roman" w:cs="Times New Roman" w:eastAsia="Times New Roman" w:hAnsi="Times New Roman"/>
+                <w:b w:val="false"/>
+                <w:bCs w:val="false"/>
+                <w:sz w:val="16"/>
+                <w:szCs w:val="16"/>
+              </w:rPr>
+              <w:t xml:space="preserve">Simulink (low order)</w:t>
+            </w:r>
+          </w:p>
+        </w:tc>
+        <w:tc>
+          <w:tcPr>
+            <w:tcW w:type="dxa" w:w="1500"/>
+            <w:tcBorders>
+              <w:top w:val="single" w:color="000000" w:sz="4"/>
+              <w:left w:val="single" w:color="000000" w:sz="4"/>
+              <w:bottom w:val="single" w:color="000000" w:sz="4"/>
+              <w:right w:val="single" w:color="000000" w:sz="4"/>
+            </w:tcBorders>
+            <w:shd w:fill="FFFF00" w:color="auto" w:val="clear"/>
+            <w:tcMar>
+              <w:top w:type="dxa" w:w="30"/>
+              <w:left w:type="dxa" w:w="60"/>
+              <w:bottom w:type="dxa" w:w="30"/>
+              <w:right w:type="dxa" w:w="60"/>
+            </w:tcMar>
+          </w:tcPr>
+          <w:p>
+            <w:pPr>
+              <w:jc w:val="left"/>
+            </w:pPr>
+            <w:r>
+              <w:rPr>
+                <w:rFonts w:ascii="Times New Roman" w:cs="Times New Roman" w:eastAsia="Times New Roman" w:hAnsi="Times New Roman"/>
+                <w:b w:val="false"/>
+                <w:bCs w:val="false"/>
+                <w:sz w:val="16"/>
+                <w:szCs w:val="16"/>
+              </w:rPr>
+              <w:t xml:space="preserve">PID</w:t>
+            </w:r>
+          </w:p>
+        </w:tc>
+        <w:tc>
+          <w:tcPr>
+            <w:tcW w:type="dxa" w:w="2100"/>
+            <w:tcBorders>
+              <w:top w:val="single" w:color="000000" w:sz="4"/>
+              <w:left w:val="single" w:color="000000" w:sz="4"/>
+              <w:bottom w:val="single" w:color="000000" w:sz="4"/>
+              <w:right w:val="single" w:color="000000" w:sz="4"/>
+            </w:tcBorders>
+            <w:shd w:fill="FFFF00" w:color="auto" w:val="clear"/>
+            <w:tcMar>
+              <w:top w:type="dxa" w:w="30"/>
+              <w:left w:type="dxa" w:w="60"/>
+              <w:bottom w:type="dxa" w:w="30"/>
+              <w:right w:type="dxa" w:w="60"/>
+            </w:tcMar>
+          </w:tcPr>
+          <w:p>
+            <w:pPr>
+              <w:jc w:val="left"/>
+            </w:pPr>
+            <w:r>
+              <w:rPr>
+                <w:rFonts w:ascii="Times New Roman" w:cs="Times New Roman" w:eastAsia="Times New Roman" w:hAnsi="Times New Roman"/>
+                <w:b w:val="false"/>
+                <w:bCs w:val="false"/>
+                <w:sz w:val="16"/>
+                <w:szCs w:val="16"/>
+              </w:rPr>
+              <w:t xml:space="preserve">RoCoF −37.23 %</w:t>
+            </w:r>
+          </w:p>
+        </w:tc>
+        <w:tc>
+          <w:tcPr>
+            <w:tcW w:type="dxa" w:w="1589"/>
+            <w:tcBorders>
+              <w:top w:val="single" w:color="000000" w:sz="4"/>
+              <w:left w:val="single" w:color="000000" w:sz="4"/>
+              <w:bottom w:val="single" w:color="000000" w:sz="4"/>
+              <w:right w:val="single" w:color="000000" w:sz="4"/>
+            </w:tcBorders>
+            <w:shd w:fill="FFFF00" w:color="auto" w:val="clear"/>
+            <w:tcMar>
+              <w:top w:type="dxa" w:w="30"/>
+              <w:left w:type="dxa" w:w="60"/>
+              <w:bottom w:type="dxa" w:w="30"/>
+              <w:right w:type="dxa" w:w="60"/>
+            </w:tcMar>
+          </w:tcPr>
+          <w:p>
+            <w:pPr>
+              <w:jc w:val="left"/>
+            </w:pPr>
+            <w:r>
+              <w:rPr>
+                <w:rFonts w:ascii="Times New Roman" w:cs="Times New Roman" w:eastAsia="Times New Roman" w:hAnsi="Times New Roman"/>
+                <w:b w:val="false"/>
+                <w:bCs w:val="false"/>
+                <w:sz w:val="16"/>
+                <w:szCs w:val="16"/>
+              </w:rPr>
+              <w:t xml:space="preserve">–</w:t>
+            </w:r>
+          </w:p>
+        </w:tc>
+      </w:tr>
+      <w:tr>
+        <w:trPr>
+          <w:cantSplit/>
+          <w:tblHeader w:val="false"/>
+        </w:trPr>
+        <w:tc>
+          <w:tcPr>
+            <w:tcW w:type="dxa" w:w="1000"/>
+            <w:tcBorders>
+              <w:top w:val="single" w:color="000000" w:sz="4"/>
+              <w:left w:val="single" w:color="000000" w:sz="4"/>
+              <w:bottom w:val="single" w:color="000000" w:sz="4"/>
+              <w:right w:val="single" w:color="000000" w:sz="4"/>
+            </w:tcBorders>
+            <w:shd w:fill="FFFF00" w:color="auto" w:val="clear"/>
+            <w:tcMar>
+              <w:top w:type="dxa" w:w="30"/>
+              <w:left w:type="dxa" w:w="60"/>
+              <w:bottom w:type="dxa" w:w="30"/>
+              <w:right w:type="dxa" w:w="60"/>
+            </w:tcMar>
+          </w:tcPr>
+          <w:p>
+            <w:pPr>
+              <w:jc w:val="left"/>
+            </w:pPr>
+            <w:r>
+              <w:rPr>
+                <w:rFonts w:ascii="Times New Roman" w:cs="Times New Roman" w:eastAsia="Times New Roman" w:hAnsi="Times New Roman"/>
+                <w:b w:val="false"/>
+                <w:bCs w:val="false"/>
+                <w:sz w:val="16"/>
+                <w:szCs w:val="16"/>
+              </w:rPr>
+              <w:t xml:space="preserve">[13] TD3</w:t>
+            </w:r>
+          </w:p>
+        </w:tc>
+        <w:tc>
+          <w:tcPr>
+            <w:tcW w:type="dxa" w:w="2150"/>
+            <w:tcBorders>
+              <w:top w:val="single" w:color="000000" w:sz="4"/>
+              <w:left w:val="single" w:color="000000" w:sz="4"/>
+              <w:bottom w:val="single" w:color="000000" w:sz="4"/>
+              <w:right w:val="single" w:color="000000" w:sz="4"/>
+            </w:tcBorders>
+            <w:shd w:fill="FFFF00" w:color="auto" w:val="clear"/>
+            <w:tcMar>
+              <w:top w:type="dxa" w:w="30"/>
+              <w:left w:type="dxa" w:w="60"/>
+              <w:bottom w:type="dxa" w:w="30"/>
+              <w:right w:type="dxa" w:w="60"/>
+            </w:tcMar>
+          </w:tcPr>
+          <w:p>
+            <w:pPr>
+              <w:jc w:val="left"/>
+            </w:pPr>
+            <w:r>
+              <w:rPr>
+                <w:rFonts w:ascii="Times New Roman" w:cs="Times New Roman" w:eastAsia="Times New Roman" w:hAnsi="Times New Roman"/>
+                <w:b w:val="false"/>
+                <w:bCs w:val="false"/>
+                <w:sz w:val="16"/>
+                <w:szCs w:val="16"/>
+              </w:rPr>
+              <w:t xml:space="preserve">380 V VSG, 0 → 50 kW step</w:t>
+            </w:r>
+          </w:p>
+        </w:tc>
+        <w:tc>
+          <w:tcPr>
+            <w:tcW w:type="dxa" w:w="1300"/>
+            <w:tcBorders>
+              <w:top w:val="single" w:color="000000" w:sz="4"/>
+              <w:left w:val="single" w:color="000000" w:sz="4"/>
+              <w:bottom w:val="single" w:color="000000" w:sz="4"/>
+              <w:right w:val="single" w:color="000000" w:sz="4"/>
+            </w:tcBorders>
+            <w:shd w:fill="FFFF00" w:color="auto" w:val="clear"/>
+            <w:tcMar>
+              <w:top w:type="dxa" w:w="30"/>
+              <w:left w:type="dxa" w:w="60"/>
+              <w:bottom w:type="dxa" w:w="30"/>
+              <w:right w:type="dxa" w:w="60"/>
+            </w:tcMar>
+          </w:tcPr>
+          <w:p>
+            <w:pPr>
+              <w:jc w:val="left"/>
+            </w:pPr>
+            <w:r>
+              <w:rPr>
+                <w:rFonts w:ascii="Times New Roman" w:cs="Times New Roman" w:eastAsia="Times New Roman" w:hAnsi="Times New Roman"/>
+                <w:b w:val="false"/>
+                <w:bCs w:val="false"/>
+                <w:sz w:val="16"/>
+                <w:szCs w:val="16"/>
+              </w:rPr>
+              <w:t xml:space="preserve">Simulink</w:t>
+            </w:r>
+          </w:p>
+        </w:tc>
+        <w:tc>
+          <w:tcPr>
+            <w:tcW w:type="dxa" w:w="1500"/>
+            <w:tcBorders>
+              <w:top w:val="single" w:color="000000" w:sz="4"/>
+              <w:left w:val="single" w:color="000000" w:sz="4"/>
+              <w:bottom w:val="single" w:color="000000" w:sz="4"/>
+              <w:right w:val="single" w:color="000000" w:sz="4"/>
+            </w:tcBorders>
+            <w:shd w:fill="FFFF00" w:color="auto" w:val="clear"/>
+            <w:tcMar>
+              <w:top w:type="dxa" w:w="30"/>
+              <w:left w:type="dxa" w:w="60"/>
+              <w:bottom w:type="dxa" w:w="30"/>
+              <w:right w:type="dxa" w:w="60"/>
+            </w:tcMar>
+          </w:tcPr>
+          <w:p>
+            <w:pPr>
+              <w:jc w:val="left"/>
+            </w:pPr>
+            <w:r>
+              <w:rPr>
+                <w:rFonts w:ascii="Times New Roman" w:cs="Times New Roman" w:eastAsia="Times New Roman" w:hAnsi="Times New Roman"/>
+                <w:b w:val="false"/>
+                <w:bCs w:val="false"/>
+                <w:sz w:val="16"/>
+                <w:szCs w:val="16"/>
+              </w:rPr>
+              <w:t xml:space="preserve">Fixed; grid-searched rule</w:t>
+            </w:r>
+          </w:p>
+        </w:tc>
+        <w:tc>
+          <w:tcPr>
+            <w:tcW w:type="dxa" w:w="2100"/>
+            <w:tcBorders>
+              <w:top w:val="single" w:color="000000" w:sz="4"/>
+              <w:left w:val="single" w:color="000000" w:sz="4"/>
+              <w:bottom w:val="single" w:color="000000" w:sz="4"/>
+              <w:right w:val="single" w:color="000000" w:sz="4"/>
+            </w:tcBorders>
+            <w:shd w:fill="FFFF00" w:color="auto" w:val="clear"/>
+            <w:tcMar>
+              <w:top w:type="dxa" w:w="30"/>
+              <w:left w:type="dxa" w:w="60"/>
+              <w:bottom w:type="dxa" w:w="30"/>
+              <w:right w:type="dxa" w:w="60"/>
+            </w:tcMar>
+          </w:tcPr>
+          <w:p>
+            <w:pPr>
+              <w:jc w:val="left"/>
+            </w:pPr>
+            <w:r>
+              <w:rPr>
+                <w:rFonts w:ascii="Times New Roman" w:cs="Times New Roman" w:eastAsia="Times New Roman" w:hAnsi="Times New Roman"/>
+                <w:b w:val="false"/>
+                <w:bCs w:val="false"/>
+                <w:sz w:val="16"/>
+                <w:szCs w:val="16"/>
+              </w:rPr>
+              <w:t xml:space="preserve">Δf 1.00 → 0.67 Hz (Table 3)</w:t>
+            </w:r>
+          </w:p>
+        </w:tc>
+        <w:tc>
+          <w:tcPr>
+            <w:tcW w:type="dxa" w:w="1589"/>
+            <w:tcBorders>
+              <w:top w:val="single" w:color="000000" w:sz="4"/>
+              <w:left w:val="single" w:color="000000" w:sz="4"/>
+              <w:bottom w:val="single" w:color="000000" w:sz="4"/>
+              <w:right w:val="single" w:color="000000" w:sz="4"/>
+            </w:tcBorders>
+            <w:shd w:fill="FFFF00" w:color="auto" w:val="clear"/>
+            <w:tcMar>
+              <w:top w:type="dxa" w:w="30"/>
+              <w:left w:type="dxa" w:w="60"/>
+              <w:bottom w:type="dxa" w:w="30"/>
+              <w:right w:type="dxa" w:w="60"/>
+            </w:tcMar>
+          </w:tcPr>
+          <w:p>
+            <w:pPr>
+              <w:jc w:val="left"/>
+            </w:pPr>
+            <w:r>
+              <w:rPr>
+                <w:rFonts w:ascii="Times New Roman" w:cs="Times New Roman" w:eastAsia="Times New Roman" w:hAnsi="Times New Roman"/>
+                <w:b w:val="false"/>
+                <w:bCs w:val="false"/>
+                <w:sz w:val="16"/>
+                <w:szCs w:val="16"/>
+              </w:rPr>
+              <w:t xml:space="preserve">–</w:t>
+            </w:r>
+          </w:p>
+        </w:tc>
+      </w:tr>
+      <w:tr>
+        <w:trPr>
+          <w:cantSplit/>
+          <w:tblHeader w:val="false"/>
+        </w:trPr>
+        <w:tc>
+          <w:tcPr>
+            <w:tcW w:type="dxa" w:w="1000"/>
+            <w:tcBorders>
+              <w:top w:val="single" w:color="000000" w:sz="4"/>
+              <w:left w:val="single" w:color="000000" w:sz="4"/>
+              <w:bottom w:val="single" w:color="000000" w:sz="4"/>
+              <w:right w:val="single" w:color="000000" w:sz="4"/>
+            </w:tcBorders>
+            <w:shd w:fill="FFFF00" w:color="auto" w:val="clear"/>
+            <w:tcMar>
+              <w:top w:type="dxa" w:w="30"/>
+              <w:left w:type="dxa" w:w="60"/>
+              <w:bottom w:type="dxa" w:w="30"/>
+              <w:right w:type="dxa" w:w="60"/>
+            </w:tcMar>
+          </w:tcPr>
+          <w:p>
+            <w:pPr>
+              <w:jc w:val="left"/>
+            </w:pPr>
+            <w:r>
+              <w:rPr>
+                <w:rFonts w:ascii="Times New Roman" w:cs="Times New Roman" w:eastAsia="Times New Roman" w:hAnsi="Times New Roman"/>
+                <w:b w:val="false"/>
+                <w:bCs w:val="false"/>
+                <w:sz w:val="16"/>
+                <w:szCs w:val="16"/>
+              </w:rPr>
+              <w:t xml:space="preserve">This study</w:t>
+            </w:r>
+          </w:p>
+        </w:tc>
+        <w:tc>
+          <w:tcPr>
+            <w:tcW w:type="dxa" w:w="2150"/>
+            <w:tcBorders>
+              <w:top w:val="single" w:color="000000" w:sz="4"/>
+              <w:left w:val="single" w:color="000000" w:sz="4"/>
+              <w:bottom w:val="single" w:color="000000" w:sz="4"/>
+              <w:right w:val="single" w:color="000000" w:sz="4"/>
+            </w:tcBorders>
+            <w:shd w:fill="FFFF00" w:color="auto" w:val="clear"/>
+            <w:tcMar>
+              <w:top w:type="dxa" w:w="30"/>
+              <w:left w:type="dxa" w:w="60"/>
+              <w:bottom w:type="dxa" w:w="30"/>
+              <w:right w:type="dxa" w:w="60"/>
+            </w:tcMar>
+          </w:tcPr>
+          <w:p>
+            <w:pPr>
+              <w:jc w:val="left"/>
+            </w:pPr>
+            <w:r>
+              <w:rPr>
+                <w:rFonts w:ascii="Times New Roman" w:cs="Times New Roman" w:eastAsia="Times New Roman" w:hAnsi="Times New Roman"/>
+                <w:b w:val="false"/>
+                <w:bCs w:val="false"/>
+                <w:sz w:val="16"/>
+                <w:szCs w:val="16"/>
+              </w:rPr>
+              <w:t xml:space="preserve">2 MVA diesel–PV–wind–BESS, 200 scenarios</w:t>
+            </w:r>
+          </w:p>
+        </w:tc>
+        <w:tc>
+          <w:tcPr>
+            <w:tcW w:type="dxa" w:w="1300"/>
+            <w:tcBorders>
+              <w:top w:val="single" w:color="000000" w:sz="4"/>
+              <w:left w:val="single" w:color="000000" w:sz="4"/>
+              <w:bottom w:val="single" w:color="000000" w:sz="4"/>
+              <w:right w:val="single" w:color="000000" w:sz="4"/>
+            </w:tcBorders>
+            <w:shd w:fill="FFFF00" w:color="auto" w:val="clear"/>
+            <w:tcMar>
+              <w:top w:type="dxa" w:w="30"/>
+              <w:left w:type="dxa" w:w="60"/>
+              <w:bottom w:type="dxa" w:w="30"/>
+              <w:right w:type="dxa" w:w="60"/>
+            </w:tcMar>
+          </w:tcPr>
+          <w:p>
+            <w:pPr>
+              <w:jc w:val="left"/>
+            </w:pPr>
+            <w:r>
+              <w:rPr>
+                <w:rFonts w:ascii="Times New Roman" w:cs="Times New Roman" w:eastAsia="Times New Roman" w:hAnsi="Times New Roman"/>
+                <w:b w:val="false"/>
+                <w:bCs w:val="false"/>
+                <w:sz w:val="16"/>
+                <w:szCs w:val="16"/>
+              </w:rPr>
+              <w:t xml:space="preserve">MATLAB + Simscape EMT</w:t>
+            </w:r>
+          </w:p>
+        </w:tc>
+        <w:tc>
+          <w:tcPr>
+            <w:tcW w:type="dxa" w:w="1500"/>
+            <w:tcBorders>
+              <w:top w:val="single" w:color="000000" w:sz="4"/>
+              <w:left w:val="single" w:color="000000" w:sz="4"/>
+              <w:bottom w:val="single" w:color="000000" w:sz="4"/>
+              <w:right w:val="single" w:color="000000" w:sz="4"/>
+            </w:tcBorders>
+            <w:shd w:fill="FFFF00" w:color="auto" w:val="clear"/>
+            <w:tcMar>
+              <w:top w:type="dxa" w:w="30"/>
+              <w:left w:type="dxa" w:w="60"/>
+              <w:bottom w:type="dxa" w:w="30"/>
+              <w:right w:type="dxa" w:w="60"/>
+            </w:tcMar>
+          </w:tcPr>
+          <w:p>
+            <w:pPr>
+              <w:jc w:val="left"/>
+            </w:pPr>
+            <w:r>
+              <w:rPr>
+                <w:rFonts w:ascii="Times New Roman" w:cs="Times New Roman" w:eastAsia="Times New Roman" w:hAnsi="Times New Roman"/>
+                <w:b w:val="false"/>
+                <w:bCs w:val="false"/>
+                <w:sz w:val="16"/>
+                <w:szCs w:val="16"/>
+              </w:rPr>
+              <w:t xml:space="preserve">Tuned fixed VSG, 5 seeds</w:t>
+            </w:r>
+          </w:p>
+        </w:tc>
+        <w:tc>
+          <w:tcPr>
+            <w:tcW w:type="dxa" w:w="2100"/>
+            <w:tcBorders>
+              <w:top w:val="single" w:color="000000" w:sz="4"/>
+              <w:left w:val="single" w:color="000000" w:sz="4"/>
+              <w:bottom w:val="single" w:color="000000" w:sz="4"/>
+              <w:right w:val="single" w:color="000000" w:sz="4"/>
+            </w:tcBorders>
+            <w:shd w:fill="FFFF00" w:color="auto" w:val="clear"/>
+            <w:tcMar>
+              <w:top w:type="dxa" w:w="30"/>
+              <w:left w:type="dxa" w:w="60"/>
+              <w:bottom w:type="dxa" w:w="30"/>
+              <w:right w:type="dxa" w:w="60"/>
+            </w:tcMar>
+          </w:tcPr>
+          <w:p>
+            <w:pPr>
+              <w:jc w:val="left"/>
+            </w:pPr>
+            <w:r>
+              <w:rPr>
+                <w:rFonts w:ascii="Times New Roman" w:cs="Times New Roman" w:eastAsia="Times New Roman" w:hAnsi="Times New Roman"/>
+                <w:b w:val="false"/>
+                <w:bCs w:val="false"/>
+                <w:sz w:val="16"/>
+                <w:szCs w:val="16"/>
+              </w:rPr>
+              <w:t xml:space="preserve">Nadir 0.573 → 0.522 Hz; infeasible 5.07 → 0.02 s</w:t>
+            </w:r>
+          </w:p>
+        </w:tc>
+        <w:tc>
+          <w:tcPr>
+            <w:tcW w:type="dxa" w:w="1589"/>
+            <w:tcBorders>
+              <w:top w:val="single" w:color="000000" w:sz="4"/>
+              <w:left w:val="single" w:color="000000" w:sz="4"/>
+              <w:bottom w:val="single" w:color="000000" w:sz="4"/>
+              <w:right w:val="single" w:color="000000" w:sz="4"/>
+            </w:tcBorders>
+            <w:shd w:fill="FFFF00" w:color="auto" w:val="clear"/>
+            <w:tcMar>
+              <w:top w:type="dxa" w:w="30"/>
+              <w:left w:type="dxa" w:w="60"/>
+              <w:bottom w:type="dxa" w:w="30"/>
+              <w:right w:type="dxa" w:w="60"/>
+            </w:tcMar>
+          </w:tcPr>
+          <w:p>
+            <w:pPr>
+              <w:jc w:val="left"/>
+            </w:pPr>
+            <w:r>
+              <w:rPr>
+                <w:rFonts w:ascii="Times New Roman" w:cs="Times New Roman" w:eastAsia="Times New Roman" w:hAnsi="Times New Roman"/>
+                <w:b w:val="false"/>
+                <w:bCs w:val="false"/>
+                <w:sz w:val="16"/>
+                <w:szCs w:val="16"/>
+              </w:rPr>
+              <w:t xml:space="preserve">Direction-aware headroom</w:t>
+            </w:r>
+          </w:p>
+        </w:tc>
+      </w:tr>
+    </w:tbl>
+    <w:p>
+      <w:pPr>
+        <w:spacing w:after="120"/>
+      </w:pPr>
+    </w:p>
+    <w:p>
+      <w:pPr>
+        <w:sectPr>
+          <w:type w:val="continuous"/>
+          <w:pgSz w:w="11906" w:h="16838" w:orient="portrait"/>
+          <w:pgMar w:top="1383" w:right="850" w:bottom="1701" w:left="1417" w:header="312" w:footer="1134" w:gutter="0"/>
+          <w:pgNumType/>
+          <w:docGrid w:linePitch="360"/>
+        </w:sectPr>
+      </w:pPr>
+    </w:p>
+    <w:p>
+      <w:pPr>
+        <w:spacing w:after="160" w:before="40"/>
+      </w:pPr>
+      <w:r>
+        <w:rPr>
+          <w:rFonts w:ascii="Times New Roman" w:cs="Times New Roman" w:eastAsia="Times New Roman" w:hAnsi="Times New Roman"/>
+          <w:b w:val="false"/>
+          <w:bCs w:val="false"/>
+          <w:i w:val="false"/>
+          <w:iCs w:val="false"/>
+          <w:sz w:val="16"/>
+          <w:szCs w:val="16"/>
+          <w:shd w:fill="FFFF00" w:color="auto" w:val="clear"/>
+        </w:rPr>
+        <w:t xml:space="preserve">Values are quoted from the cited works; 50 Hz and 60 Hz systems of different size are included, so rows are not directly comparable. –: not reported.</w:t>
+      </w:r>
+    </w:p>
+    <w:p>
+      <w:pPr>
+        <w:ind w:firstLine="227"/>
+        <w:jc w:val="both"/>
+      </w:pPr>
+      <w:r>
+        <w:rPr>
+          <w:rFonts w:ascii="Times New Roman" w:cs="Times New Roman" w:eastAsia="Times New Roman" w:hAnsi="Times New Roman"/>
+          <w:b/>
+          <w:bCs/>
+          <w:i w:val="false"/>
+          <w:iCs w:val="false"/>
+          <w:sz w:val="20"/>
+          <w:szCs w:val="20"/>
         </w:rPr>
         <w:t xml:space="preserve">Averaged versus circuit-level models. </w:t>
       </w:r>
@@ -15467,6 +17863,46 @@
           <w:szCs w:val="16"/>
         </w:rPr>
         <w:t xml:space="preserve">M. Glavic, “(Deep) reinforcement learning for electric power system control and related problems: A short review and perspectives,” Annu. Rev. Control, vol. 48, pp. 22–35, 2019.</w:t>
+      </w:r>
+    </w:p>
+    <w:p>
+      <w:pPr>
+        <w:spacing w:after="40"/>
+        <w:ind w:left="340" w:hanging="340"/>
+        <w:jc w:val="both"/>
+      </w:pPr>
+      <w:r>
+        <w:rPr>
+          <w:rFonts w:ascii="Times New Roman" w:cs="Times New Roman" w:eastAsia="Times New Roman" w:hAnsi="Times New Roman"/>
+          <w:i w:val="false"/>
+          <w:iCs w:val="false"/>
+          <w:sz w:val="16"/>
+          <w:szCs w:val="16"/>
+        </w:rPr>
+        <w:t xml:space="preserve">[32] </w:t>
+      </w:r>
+      <w:r>
+        <w:rPr>
+          <w:rFonts w:ascii="Times New Roman" w:cs="Times New Roman" w:eastAsia="Times New Roman" w:hAnsi="Times New Roman"/>
+          <w:i w:val="false"/>
+          <w:iCs w:val="false"/>
+          <w:sz w:val="16"/>
+          <w:szCs w:val="16"/>
+        </w:rPr>
+        <w:t xml:space="preserve">O. E. Egbomwan, S. Liu, H. Chaoui and X. Wang, “Learning-based predictive virtual inertia control for frequency regulation in low inertia power grids,” IEEE Open J. Circuits Syst., vol. 6, pp. 504–519, 2025.</w:t>
+      </w:r>
+      <w:r>
+        <w:rPr>
+          <w:rFonts w:ascii="Times New Roman" w:cs="Times New Roman" w:eastAsia="Times New Roman" w:hAnsi="Times New Roman"/>
+          <w:b w:val="false"/>
+          <w:bCs w:val="false"/>
+          <w:i w:val="false"/>
+          <w:iCs w:val="false"/>
+          <w:sz w:val="16"/>
+          <w:szCs w:val="16"/>
+          <w:shd w:fill="FFFF00" w:color="auto" w:val="clear"/>
+        </w:rPr>
+        <w:t xml:space="preserve"> [AUTHOR: new reference added with the comparison table; review]</w:t>
       </w:r>
     </w:p>
     <w:p>

</xml_diff>